<commit_message>
closed chap with excercises
</commit_message>
<xml_diff>
--- a/docs/Routineaufgaben_Automatisieren.docx
+++ b/docs/Routineaufgaben_Automatisieren.docx
@@ -17,13 +17,8 @@
       </w:r>
     </w:p>
     <w:p>
-      <w:proofErr w:type="gramStart"/>
-      <w:r>
-        <w:t>Wiederholung  Seite</w:t>
-      </w:r>
-      <w:proofErr w:type="gramEnd"/>
-      <w:r>
-        <w:t xml:space="preserve"> 229</w:t>
+      <w:r>
+        <w:t>Wiederholung  Seite 229</w:t>
       </w:r>
       <w:r>
         <w:t>, 215</w:t>
@@ -32,7 +27,7 @@
         <w:t>, 1</w:t>
       </w:r>
       <w:r>
-        <w:t>58</w:t>
+        <w:t>73</w:t>
       </w:r>
     </w:p>
     <w:p>
@@ -47,32 +42,14 @@
       </w:r>
     </w:p>
     <w:p>
-      <w:proofErr w:type="spellStart"/>
-      <w:proofErr w:type="gramStart"/>
-      <w:r>
-        <w:t>Dicotonary.get</w:t>
-      </w:r>
-      <w:proofErr w:type="spellEnd"/>
-      <w:r>
-        <w:t>(</w:t>
-      </w:r>
-      <w:proofErr w:type="gramEnd"/>
-      <w:r>
-        <w:t xml:space="preserve">k, </w:t>
-      </w:r>
-      <w:proofErr w:type="spellStart"/>
-      <w:r>
-        <w:t>de</w:t>
+      <w:r>
+        <w:t>Dicotonary.get(k, de</w:t>
       </w:r>
       <w:r>
         <w:t>f</w:t>
       </w:r>
       <w:r>
-        <w:t>ault</w:t>
-      </w:r>
-      <w:proofErr w:type="spellEnd"/>
-      <w:r>
-        <w:t>) + 1</w:t>
+        <w:t>ault) + 1</w:t>
       </w:r>
       <w:r>
         <w:tab/>
@@ -102,75 +79,23 @@
       </w:r>
     </w:p>
     <w:p>
-      <w:proofErr w:type="spellStart"/>
-      <w:r>
-        <w:t>isX-Stringmethoden</w:t>
-      </w:r>
-      <w:proofErr w:type="spellEnd"/>
-      <w:r>
-        <w:t xml:space="preserve"> Seite 172</w:t>
+      <w:r>
+        <w:t>isX-Stringmethoden Seite 172</w:t>
       </w:r>
     </w:p>
     <w:p/>
     <w:p>
       <w:r>
-        <w:t xml:space="preserve">Die Methoden </w:t>
-      </w:r>
-      <w:proofErr w:type="spellStart"/>
-      <w:proofErr w:type="gramStart"/>
-      <w:r>
-        <w:t>rjust</w:t>
-      </w:r>
-      <w:proofErr w:type="spellEnd"/>
-      <w:r>
-        <w:t>(</w:t>
-      </w:r>
-      <w:proofErr w:type="gramEnd"/>
-      <w:r>
-        <w:t xml:space="preserve">) und </w:t>
-      </w:r>
-      <w:proofErr w:type="spellStart"/>
-      <w:proofErr w:type="gramStart"/>
-      <w:r>
-        <w:t>ljust</w:t>
-      </w:r>
-      <w:proofErr w:type="spellEnd"/>
-      <w:r>
-        <w:t>(</w:t>
-      </w:r>
-      <w:proofErr w:type="gramEnd"/>
-      <w:r>
-        <w:t xml:space="preserve">) werden für einen String aufgerufen und </w:t>
-      </w:r>
-      <w:proofErr w:type="gramStart"/>
-      <w:r>
-        <w:t xml:space="preserve">geben </w:t>
+        <w:t xml:space="preserve">Die Methoden rjust() und ljust() werden für einen String aufgerufen und geben </w:t>
       </w:r>
       <w:r>
         <w:t xml:space="preserve"> </w:t>
       </w:r>
       <w:r>
-        <w:t>eine</w:t>
-      </w:r>
-      <w:proofErr w:type="gramEnd"/>
-      <w:r>
-        <w:t xml:space="preserve"> Variante dieses Strings zurück, bei der der Text mithilfe von Leerzeichen ausgerichtet ist</w:t>
-      </w:r>
-      <w:r>
-        <w:t xml:space="preserve">. </w:t>
-      </w:r>
-      <w:proofErr w:type="gramStart"/>
-      <w:r>
-        <w:t>.</w:t>
-      </w:r>
-      <w:proofErr w:type="spellStart"/>
-      <w:r>
-        <w:t>center</w:t>
-      </w:r>
-      <w:proofErr w:type="spellEnd"/>
-      <w:proofErr w:type="gramEnd"/>
-      <w:r>
-        <w:t>()</w:t>
+        <w:t>eine Variante dieses Strings zurück, bei der der Text mithilfe von Leerzeichen ausgerichtet ist</w:t>
+      </w:r>
+      <w:r>
+        <w:t>. .center()</w:t>
       </w:r>
     </w:p>
     <w:p>
@@ -181,41 +106,7 @@
     <w:p/>
     <w:p>
       <w:r>
-        <w:t xml:space="preserve">Das Modul </w:t>
-      </w:r>
-      <w:proofErr w:type="spellStart"/>
-      <w:r>
-        <w:t>pyperclip</w:t>
-      </w:r>
-      <w:proofErr w:type="spellEnd"/>
-      <w:r>
-        <w:t xml:space="preserve"> enthält die Funktionen </w:t>
-      </w:r>
-      <w:proofErr w:type="spellStart"/>
-      <w:proofErr w:type="gramStart"/>
-      <w:r>
-        <w:t>copy</w:t>
-      </w:r>
-      <w:proofErr w:type="spellEnd"/>
-      <w:r>
-        <w:t>(</w:t>
-      </w:r>
-      <w:proofErr w:type="gramEnd"/>
-      <w:r>
-        <w:t xml:space="preserve">) und </w:t>
-      </w:r>
-      <w:proofErr w:type="spellStart"/>
-      <w:proofErr w:type="gramStart"/>
-      <w:r>
-        <w:t>paste</w:t>
-      </w:r>
-      <w:proofErr w:type="spellEnd"/>
-      <w:r>
-        <w:t>(</w:t>
-      </w:r>
-      <w:proofErr w:type="gramEnd"/>
-      <w:r>
-        <w:t>), die Text an die Zwischenablage des Computers senden bzw. von dort empfangen können.</w:t>
+        <w:t>Das Modul pyperclip enthält die Funktionen copy() und paste(), die Text an die Zwischenablage des Computers senden bzw. von dort empfangen können.</w:t>
       </w:r>
     </w:p>
     <w:p/>
@@ -226,13 +117,8 @@
     </w:p>
     <w:p/>
     <w:p>
-      <w:proofErr w:type="spellStart"/>
-      <w:r>
-        <w:t>Sys.argv</w:t>
-      </w:r>
-      <w:proofErr w:type="spellEnd"/>
-      <w:r>
-        <w:t xml:space="preserve"> </w:t>
+      <w:r>
+        <w:t xml:space="preserve">Sys.argv </w:t>
       </w:r>
       <w:r>
         <w:tab/>
@@ -242,41 +128,10 @@
     <w:p/>
     <w:p>
       <w:r>
-        <w:t xml:space="preserve">Aufgabe Projekt </w:t>
-      </w:r>
-      <w:proofErr w:type="spellStart"/>
-      <w:proofErr w:type="gramStart"/>
-      <w:r>
-        <w:t>TablePrint</w:t>
-      </w:r>
-      <w:proofErr w:type="spellEnd"/>
-      <w:proofErr w:type="gramEnd"/>
-      <w:r>
-        <w:t xml:space="preserve"> Seite 187 wiederholen </w:t>
-      </w:r>
-      <w:proofErr w:type="spellStart"/>
-      <w:proofErr w:type="gramStart"/>
-      <w:r>
-        <w:t>indexing</w:t>
-      </w:r>
-      <w:proofErr w:type="spellEnd"/>
-      <w:r>
-        <w:t xml:space="preserve">  mit</w:t>
-      </w:r>
-      <w:proofErr w:type="gramEnd"/>
-      <w:r>
-        <w:t xml:space="preserve"> verschachtelten Schleifen und </w:t>
-      </w:r>
-      <w:proofErr w:type="spellStart"/>
-      <w:r>
-        <w:t>enum</w:t>
-      </w:r>
-      <w:r>
-        <w:t>erate</w:t>
-      </w:r>
-      <w:proofErr w:type="spellEnd"/>
-      <w:r>
-        <w:t xml:space="preserve"> üben</w:t>
+        <w:t>Aufgabe Projekt TablePrint Seite 187 wiederholen indexing  mit verschachtelten Schleifen und enum</w:t>
+      </w:r>
+      <w:r>
+        <w:t>erate üben</w:t>
       </w:r>
       <w:r>
         <w:t xml:space="preserve">. </w:t>
@@ -289,114 +144,29 @@
     </w:p>
     <w:p>
       <w:r>
-        <w:t xml:space="preserve">Widerholungsfragen </w:t>
-      </w:r>
-      <w:proofErr w:type="spellStart"/>
-      <w:proofErr w:type="gramStart"/>
-      <w:r>
-        <w:t>Regex</w:t>
-      </w:r>
-      <w:proofErr w:type="spellEnd"/>
-      <w:proofErr w:type="gramEnd"/>
-      <w:r>
-        <w:t xml:space="preserve"> Seite 218</w:t>
-      </w:r>
-    </w:p>
-    <w:p>
-      <w:proofErr w:type="spellStart"/>
-      <w:r>
-        <w:t>Regex</w:t>
-      </w:r>
-      <w:proofErr w:type="spellEnd"/>
-      <w:r>
-        <w:t xml:space="preserve"> </w:t>
-      </w:r>
-      <w:proofErr w:type="gramStart"/>
-      <w:r>
-        <w:t>Projekt</w:t>
-      </w:r>
-      <w:proofErr w:type="gramEnd"/>
-      <w:r>
-        <w:t xml:space="preserve"> </w:t>
+        <w:t>Widerholungsfragen Regex Seite 218</w:t>
+      </w:r>
+    </w:p>
+    <w:p>
+      <w:r>
+        <w:t xml:space="preserve">Regex Projekt </w:t>
       </w:r>
       <w:r>
         <w:t xml:space="preserve">Seite 220 wiederholen. </w:t>
       </w:r>
-      <w:proofErr w:type="spellStart"/>
-      <w:r>
-        <w:t>Regex</w:t>
-      </w:r>
-      <w:proofErr w:type="spellEnd"/>
-      <w:r>
-        <w:t xml:space="preserve"> Projekt 248 wiederholen. </w:t>
+      <w:r>
+        <w:t xml:space="preserve">Regex Projekt 248 wiederholen. </w:t>
       </w:r>
     </w:p>
     <w:p/>
     <w:p>
-      <w:proofErr w:type="spellStart"/>
-      <w:proofErr w:type="gramStart"/>
-      <w:r>
-        <w:t>Ppritnt</w:t>
-      </w:r>
-      <w:proofErr w:type="spellEnd"/>
-      <w:r>
-        <w:t>(</w:t>
-      </w:r>
-      <w:proofErr w:type="gramEnd"/>
-      <w:r>
-        <w:t>) „Saubere Ausgabe“ Kapitel 5 und Seite 236,</w:t>
-      </w:r>
-    </w:p>
-    <w:p>
-      <w:proofErr w:type="spellStart"/>
-      <w:r>
-        <w:t>Zb</w:t>
-      </w:r>
-      <w:proofErr w:type="spellEnd"/>
-      <w:r>
-        <w:t xml:space="preserve">. </w:t>
-      </w:r>
-      <w:proofErr w:type="spellStart"/>
-      <w:r>
-        <w:t>dictionarys</w:t>
-      </w:r>
-      <w:proofErr w:type="spellEnd"/>
-      <w:r>
-        <w:t xml:space="preserve"> die im Python-Format bleiben sollen mit </w:t>
-      </w:r>
-      <w:proofErr w:type="spellStart"/>
-      <w:proofErr w:type="gramStart"/>
-      <w:r>
-        <w:t>pprint.pformat</w:t>
-      </w:r>
-      <w:proofErr w:type="spellEnd"/>
-      <w:proofErr w:type="gramEnd"/>
-      <w:r>
-        <w:t xml:space="preserve">() z.B. in als eigenständige Datei, als Modul speichern wird als </w:t>
-      </w:r>
-      <w:proofErr w:type="gramStart"/>
-      <w:r>
-        <w:t>liste</w:t>
-      </w:r>
-      <w:proofErr w:type="gramEnd"/>
-      <w:r>
-        <w:t xml:space="preserve"> die das </w:t>
-      </w:r>
-      <w:proofErr w:type="spellStart"/>
-      <w:r>
-        <w:t>dictionary</w:t>
-      </w:r>
-      <w:proofErr w:type="spellEnd"/>
-      <w:r>
-        <w:t xml:space="preserve"> </w:t>
-      </w:r>
-      <w:proofErr w:type="gramStart"/>
-      <w:r>
-        <w:t>enthält</w:t>
-      </w:r>
-      <w:proofErr w:type="gramEnd"/>
-      <w:r>
-        <w:t xml:space="preserve"> gespeichert. </w:t>
+      <w:r>
+        <w:t>Ppritnt() „Saubere Ausgabe“ Kapitel 5 und Seite 236,</w:t>
+      </w:r>
+    </w:p>
+    <w:p>
+      <w:r>
+        <w:t xml:space="preserve">Zb. dictionarys die im Python-Format bleiben sollen mit pprint.pformat() z.B. in als eigenständige Datei, als Modul speichern wird als liste die das dictionary enthält gespeichert. </w:t>
       </w:r>
     </w:p>
     <w:p>
@@ -411,23 +181,7 @@
           <w:highlight w:val="yellow"/>
           <w:u w:val="single"/>
         </w:rPr>
-        <w:t xml:space="preserve">Der </w:t>
-      </w:r>
-      <w:proofErr w:type="gramStart"/>
-      <w:r>
-        <w:rPr>
-          <w:highlight w:val="yellow"/>
-          <w:u w:val="single"/>
-        </w:rPr>
-        <w:t>bist</w:t>
-      </w:r>
-      <w:proofErr w:type="gramEnd"/>
-      <w:r>
-        <w:rPr>
-          <w:highlight w:val="yellow"/>
-          <w:u w:val="single"/>
-        </w:rPr>
-        <w:t xml:space="preserve"> jetzt beste Weg ein </w:t>
+        <w:t xml:space="preserve">Der bist jetzt beste Weg ein </w:t>
       </w:r>
       <w:r>
         <w:rPr>
@@ -436,33 +190,13 @@
           <w:highlight w:val="yellow"/>
           <w:u w:val="single"/>
         </w:rPr>
-        <w:t xml:space="preserve">Skript aufzurufen, Bat </w:t>
-      </w:r>
-      <w:proofErr w:type="spellStart"/>
-      <w:r>
-        <w:rPr>
-          <w:b/>
-          <w:bCs/>
+        <w:t xml:space="preserve">Skript aufzurufen, Bat datei </w:t>
+      </w:r>
+      <w:r>
+        <w:rPr>
           <w:highlight w:val="yellow"/>
           <w:u w:val="single"/>
         </w:rPr>
-        <w:t>datei</w:t>
-      </w:r>
-      <w:proofErr w:type="spellEnd"/>
-      <w:r>
-        <w:rPr>
-          <w:b/>
-          <w:bCs/>
-          <w:highlight w:val="yellow"/>
-          <w:u w:val="single"/>
-        </w:rPr>
-        <w:t xml:space="preserve"> </w:t>
-      </w:r>
-      <w:r>
-        <w:rPr>
-          <w:highlight w:val="yellow"/>
-          <w:u w:val="single"/>
-        </w:rPr>
         <w:t>in einen Path-Ordner:</w:t>
       </w:r>
       <w:r>
@@ -521,32 +255,14 @@
       </w:r>
       <w:r>
         <w:br/>
-        <w:t xml:space="preserve">wiederum liest diese Argumente in die Liste </w:t>
-      </w:r>
-      <w:proofErr w:type="spellStart"/>
-      <w:proofErr w:type="gramStart"/>
-      <w:r>
-        <w:t>sys.argv</w:t>
-      </w:r>
-      <w:proofErr w:type="spellEnd"/>
-      <w:proofErr w:type="gramEnd"/>
-      <w:r>
-        <w:t xml:space="preserve"> ein.</w:t>
+        <w:t>wiederum liest diese Argumente in die Liste sys.argv ein.</w:t>
       </w:r>
     </w:p>
     <w:p/>
     <w:p/>
     <w:p>
       <w:r>
-        <w:t xml:space="preserve">Beispiel Raw-String über mehre Zeilen, „…\“darf nicht am </w:t>
-      </w:r>
-      <w:proofErr w:type="spellStart"/>
-      <w:r>
-        <w:t>ende</w:t>
-      </w:r>
-      <w:proofErr w:type="spellEnd"/>
-      <w:r>
-        <w:t xml:space="preserve"> der Zeile stehen</w:t>
+        <w:t>Beispiel Raw-String über mehre Zeilen, „…\“darf nicht am ende der Zeile stehen</w:t>
       </w:r>
     </w:p>
     <w:p>
@@ -563,7 +279,6 @@
           <w14:ligatures w14:val="none"/>
         </w:rPr>
       </w:pPr>
-      <w:proofErr w:type="spellStart"/>
       <w:r>
         <w:rPr>
           <w:rFonts w:ascii="JetBrains Mono NL" w:eastAsia="Times New Roman" w:hAnsi="JetBrains Mono NL" w:cs="JetBrains Mono NL"/>
@@ -576,7 +291,6 @@
         </w:rPr>
         <w:t>zipdatei</w:t>
       </w:r>
-      <w:proofErr w:type="spellEnd"/>
       <w:r>
         <w:rPr>
           <w:rFonts w:ascii="JetBrains Mono NL" w:eastAsia="Times New Roman" w:hAnsi="JetBrains Mono NL" w:cs="JetBrains Mono NL"/>
@@ -821,9 +535,20 @@
           <w:lang w:eastAsia="de-DE"/>
           <w14:ligatures w14:val="none"/>
         </w:rPr>
-        <w:t>\</w:t>
-      </w:r>
-      <w:proofErr w:type="spellStart"/>
+        <w:t>\R</w:t>
+      </w:r>
+      <w:r>
+        <w:rPr>
+          <w:rFonts w:ascii="JetBrains Mono NL" w:eastAsia="Times New Roman" w:hAnsi="JetBrains Mono NL" w:cs="JetBrains Mono NL"/>
+          <w:color w:val="E06C75"/>
+          <w:kern w:val="0"/>
+          <w:sz w:val="18"/>
+          <w:szCs w:val="18"/>
+          <w:lang w:eastAsia="de-DE"/>
+          <w14:ligatures w14:val="none"/>
+        </w:rPr>
+        <w:t>outine_Aufgaben_Automatisieren</w:t>
+      </w:r>
       <w:r>
         <w:rPr>
           <w:rFonts w:ascii="JetBrains Mono NL" w:eastAsia="Times New Roman" w:hAnsi="JetBrains Mono NL" w:cs="JetBrains Mono NL"/>
@@ -834,7 +559,7 @@
           <w:lang w:eastAsia="de-DE"/>
           <w14:ligatures w14:val="none"/>
         </w:rPr>
-        <w:t>R</w:t>
+        <w:t>\n</w:t>
       </w:r>
       <w:r>
         <w:rPr>
@@ -846,31 +571,6 @@
           <w:lang w:eastAsia="de-DE"/>
           <w14:ligatures w14:val="none"/>
         </w:rPr>
-        <w:t>outine_Aufgaben_Automatisieren</w:t>
-      </w:r>
-      <w:proofErr w:type="spellEnd"/>
-      <w:r>
-        <w:rPr>
-          <w:rFonts w:ascii="JetBrains Mono NL" w:eastAsia="Times New Roman" w:hAnsi="JetBrains Mono NL" w:cs="JetBrains Mono NL"/>
-          <w:color w:val="56B6C2"/>
-          <w:kern w:val="0"/>
-          <w:sz w:val="18"/>
-          <w:szCs w:val="18"/>
-          <w:lang w:eastAsia="de-DE"/>
-          <w14:ligatures w14:val="none"/>
-        </w:rPr>
-        <w:t>\n</w:t>
-      </w:r>
-      <w:r>
-        <w:rPr>
-          <w:rFonts w:ascii="JetBrains Mono NL" w:eastAsia="Times New Roman" w:hAnsi="JetBrains Mono NL" w:cs="JetBrains Mono NL"/>
-          <w:color w:val="E06C75"/>
-          <w:kern w:val="0"/>
-          <w:sz w:val="18"/>
-          <w:szCs w:val="18"/>
-          <w:lang w:eastAsia="de-DE"/>
-          <w14:ligatures w14:val="none"/>
-        </w:rPr>
         <w:t>eu.zip"</w:t>
       </w:r>
       <w:r>
@@ -913,7 +613,6 @@
         </w:rPr>
         <w:t xml:space="preserve">wiederholen </w:t>
       </w:r>
-      <w:proofErr w:type="spellStart"/>
       <w:r>
         <w:rPr>
           <w:b/>
@@ -930,19 +629,13 @@
         </w:rPr>
         <w:t>gEx</w:t>
       </w:r>
-      <w:proofErr w:type="spellEnd"/>
     </w:p>
     <w:p>
       <w:pPr>
         <w:pStyle w:val="berschrift2"/>
       </w:pPr>
-      <w:proofErr w:type="spellStart"/>
-      <w:r>
-        <w:t>Pathlib</w:t>
-      </w:r>
-      <w:proofErr w:type="spellEnd"/>
-      <w:r>
-        <w:t>, OS, Pfade usw.</w:t>
+      <w:r>
+        <w:t>Pathlib, OS, Pfade usw.</w:t>
       </w:r>
     </w:p>
     <w:p>
@@ -951,22 +644,12 @@
           <w:lang w:val="en-US"/>
         </w:rPr>
       </w:pPr>
-      <w:proofErr w:type="spellStart"/>
-      <w:proofErr w:type="gramStart"/>
       <w:r>
         <w:rPr>
           <w:lang w:val="en-US"/>
         </w:rPr>
-        <w:t>os.path</w:t>
-      </w:r>
-      <w:proofErr w:type="gramEnd"/>
-      <w:r>
-        <w:rPr>
-          <w:lang w:val="en-US"/>
-        </w:rPr>
-        <w:t>.</w:t>
-      </w:r>
-      <w:proofErr w:type="gramStart"/>
+        <w:t>os.path.</w:t>
+      </w:r>
       <w:r>
         <w:rPr>
           <w:b/>
@@ -974,29 +657,16 @@
         </w:rPr>
         <w:t>relpath</w:t>
       </w:r>
-      <w:proofErr w:type="spellEnd"/>
       <w:r>
         <w:rPr>
           <w:lang w:val="en-US"/>
         </w:rPr>
-        <w:t>(</w:t>
-      </w:r>
-      <w:proofErr w:type="gramEnd"/>
-      <w:r>
-        <w:rPr>
-          <w:lang w:val="en-US"/>
-        </w:rPr>
-        <w:t xml:space="preserve">'C:\\Windows', 'C:\\spam\\eggs') </w:t>
-      </w:r>
-    </w:p>
-    <w:p>
-      <w:proofErr w:type="gramStart"/>
-      <w:r>
-        <w:t>'..</w:t>
-      </w:r>
-      <w:proofErr w:type="gramEnd"/>
-      <w:r>
-        <w:t>\\..\\Windows'</w:t>
+        <w:t xml:space="preserve">('C:\\Windows', 'C:\\spam\\eggs') </w:t>
+      </w:r>
+    </w:p>
+    <w:p>
+      <w:r>
+        <w:t>'..\\..\\Windows'</w:t>
       </w:r>
     </w:p>
     <w:p/>
@@ -1021,143 +691,44 @@
     </w:p>
     <w:p>
       <w:r>
-        <w:t xml:space="preserve">Basisname eines Path-Objektes in </w:t>
-      </w:r>
-      <w:proofErr w:type="spellStart"/>
-      <w:r>
-        <w:t>pathlib</w:t>
-      </w:r>
-      <w:proofErr w:type="spellEnd"/>
-      <w:r>
-        <w:t xml:space="preserve"> = .</w:t>
-      </w:r>
-      <w:proofErr w:type="spellStart"/>
-      <w:r>
-        <w:t>name</w:t>
-      </w:r>
-      <w:proofErr w:type="spellEnd"/>
+        <w:t>Basisname eines Path-Objektes in pathlib = .name</w:t>
+      </w:r>
       <w:r>
         <w:br/>
         <w:t xml:space="preserve">in OS:  </w:t>
       </w:r>
-      <w:proofErr w:type="spellStart"/>
-      <w:proofErr w:type="gramStart"/>
-      <w:r>
-        <w:t>os.path</w:t>
-      </w:r>
-      <w:proofErr w:type="gramEnd"/>
-      <w:r>
-        <w:t>.basename</w:t>
-      </w:r>
-      <w:proofErr w:type="spellEnd"/>
-      <w:r>
-        <w:t>(</w:t>
-      </w:r>
-      <w:proofErr w:type="spellStart"/>
+      <w:r>
+        <w:t>os.path.basename(path)</w:t>
+      </w:r>
+    </w:p>
+    <w:p>
+      <w:r>
+        <w:t>Verzeichnisname in pathlib:= path_objekt.parent</w:t>
+      </w:r>
+      <w:r>
+        <w:br/>
+        <w:t xml:space="preserve">in OS: </w:t>
+      </w:r>
+      <w:r>
+        <w:t>os.path.</w:t>
+      </w:r>
+      <w:r>
+        <w:t>dirname</w:t>
+      </w:r>
+      <w:r>
+        <w:t>(path)</w:t>
+      </w:r>
+    </w:p>
+    <w:p>
+      <w:r>
+        <w:t xml:space="preserve">Tupel(vezeinsname, basename) = </w:t>
+      </w:r>
+      <w:r>
+        <w:t>os.path.split(</w:t>
+      </w:r>
       <w:r>
         <w:t>path</w:t>
       </w:r>
-      <w:proofErr w:type="spellEnd"/>
-      <w:r>
-        <w:t>)</w:t>
-      </w:r>
-    </w:p>
-    <w:p>
-      <w:r>
-        <w:t xml:space="preserve">Verzeichnisname in </w:t>
-      </w:r>
-      <w:proofErr w:type="spellStart"/>
-      <w:proofErr w:type="gramStart"/>
-      <w:r>
-        <w:t>pathlib</w:t>
-      </w:r>
-      <w:proofErr w:type="spellEnd"/>
-      <w:r>
-        <w:t>:=</w:t>
-      </w:r>
-      <w:proofErr w:type="gramEnd"/>
-      <w:r>
-        <w:t xml:space="preserve"> </w:t>
-      </w:r>
-      <w:proofErr w:type="spellStart"/>
-      <w:r>
-        <w:t>path_</w:t>
-      </w:r>
-      <w:proofErr w:type="gramStart"/>
-      <w:r>
-        <w:t>objekt.parent</w:t>
-      </w:r>
-      <w:proofErr w:type="spellEnd"/>
-      <w:proofErr w:type="gramEnd"/>
-      <w:r>
-        <w:br/>
-        <w:t xml:space="preserve">in OS: </w:t>
-      </w:r>
-      <w:proofErr w:type="spellStart"/>
-      <w:proofErr w:type="gramStart"/>
-      <w:r>
-        <w:t>os.path</w:t>
-      </w:r>
-      <w:proofErr w:type="gramEnd"/>
-      <w:r>
-        <w:t>.</w:t>
-      </w:r>
-      <w:r>
-        <w:t>dirname</w:t>
-      </w:r>
-      <w:proofErr w:type="spellEnd"/>
-      <w:r>
-        <w:t>(</w:t>
-      </w:r>
-      <w:proofErr w:type="spellStart"/>
-      <w:r>
-        <w:t>path</w:t>
-      </w:r>
-      <w:proofErr w:type="spellEnd"/>
-      <w:r>
-        <w:t>)</w:t>
-      </w:r>
-    </w:p>
-    <w:p>
-      <w:proofErr w:type="gramStart"/>
-      <w:r>
-        <w:t>Tupel(</w:t>
-      </w:r>
-      <w:proofErr w:type="spellStart"/>
-      <w:proofErr w:type="gramEnd"/>
-      <w:r>
-        <w:t>vezeinsname</w:t>
-      </w:r>
-      <w:proofErr w:type="spellEnd"/>
-      <w:r>
-        <w:t xml:space="preserve">, </w:t>
-      </w:r>
-      <w:proofErr w:type="spellStart"/>
-      <w:r>
-        <w:t>basename</w:t>
-      </w:r>
-      <w:proofErr w:type="spellEnd"/>
-      <w:r>
-        <w:t xml:space="preserve">) = </w:t>
-      </w:r>
-      <w:proofErr w:type="spellStart"/>
-      <w:proofErr w:type="gramStart"/>
-      <w:r>
-        <w:t>os.path</w:t>
-      </w:r>
-      <w:proofErr w:type="gramEnd"/>
-      <w:r>
-        <w:t>.split</w:t>
-      </w:r>
-      <w:proofErr w:type="spellEnd"/>
-      <w:r>
-        <w:t>(</w:t>
-      </w:r>
-      <w:proofErr w:type="spellStart"/>
-      <w:r>
-        <w:t>path</w:t>
-      </w:r>
-      <w:proofErr w:type="spellEnd"/>
       <w:r>
         <w:t>)</w:t>
       </w:r>
@@ -1170,183 +741,44 @@
           <w:sz w:val="16"/>
           <w:szCs w:val="16"/>
         </w:rPr>
-        <w:t xml:space="preserve">Allerdings ist </w:t>
-      </w:r>
-      <w:proofErr w:type="spellStart"/>
-      <w:proofErr w:type="gramStart"/>
+        <w:t>Allerdings ist os.path.split() eine praktische Abkürzung.</w:t>
+      </w:r>
       <w:r>
         <w:rPr>
           <w:rFonts w:ascii="Arial" w:hAnsi="Arial" w:cs="Arial"/>
           <w:sz w:val="16"/>
           <w:szCs w:val="16"/>
         </w:rPr>
-        <w:t>os.path</w:t>
-      </w:r>
-      <w:proofErr w:type="gramEnd"/>
+        <w:br/>
+        <w:t xml:space="preserve">Beachten Sie aber, dass os.path.split() keinen Dateipfad entgegennimmt und </w:t>
+      </w:r>
       <w:r>
         <w:rPr>
           <w:rFonts w:ascii="Arial" w:hAnsi="Arial" w:cs="Arial"/>
           <w:sz w:val="16"/>
           <w:szCs w:val="16"/>
         </w:rPr>
-        <w:t>.</w:t>
-      </w:r>
-      <w:proofErr w:type="gramStart"/>
+        <w:br/>
+        <w:t xml:space="preserve">daraus eine Liste der Strings für die einzelnen Ordner zurückgibt. Für diesen </w:t>
+      </w:r>
       <w:r>
         <w:rPr>
           <w:rFonts w:ascii="Arial" w:hAnsi="Arial" w:cs="Arial"/>
           <w:sz w:val="16"/>
           <w:szCs w:val="16"/>
         </w:rPr>
-        <w:t>split</w:t>
-      </w:r>
-      <w:proofErr w:type="spellEnd"/>
+        <w:br/>
+        <w:t xml:space="preserve">Zweck müssen Sie den Pfad mit der Stringmethode split() zerlegen und ihr die </w:t>
+      </w:r>
       <w:r>
         <w:rPr>
           <w:rFonts w:ascii="Arial" w:hAnsi="Arial" w:cs="Arial"/>
           <w:sz w:val="16"/>
           <w:szCs w:val="16"/>
         </w:rPr>
-        <w:t>(</w:t>
-      </w:r>
-      <w:proofErr w:type="gramEnd"/>
-      <w:r>
-        <w:rPr>
-          <w:rFonts w:ascii="Arial" w:hAnsi="Arial" w:cs="Arial"/>
-          <w:sz w:val="16"/>
-          <w:szCs w:val="16"/>
-        </w:rPr>
-        <w:t>) eine praktische Abkürzung.</w:t>
-      </w:r>
-      <w:r>
-        <w:rPr>
-          <w:rFonts w:ascii="Arial" w:hAnsi="Arial" w:cs="Arial"/>
-          <w:sz w:val="16"/>
-          <w:szCs w:val="16"/>
-        </w:rPr>
-        <w:br/>
-        <w:t xml:space="preserve">Beachten Sie aber, dass </w:t>
-      </w:r>
-      <w:proofErr w:type="spellStart"/>
-      <w:proofErr w:type="gramStart"/>
-      <w:r>
-        <w:rPr>
-          <w:rFonts w:ascii="Arial" w:hAnsi="Arial" w:cs="Arial"/>
-          <w:sz w:val="16"/>
-          <w:szCs w:val="16"/>
-        </w:rPr>
-        <w:t>os.path</w:t>
-      </w:r>
-      <w:proofErr w:type="gramEnd"/>
-      <w:r>
-        <w:rPr>
-          <w:rFonts w:ascii="Arial" w:hAnsi="Arial" w:cs="Arial"/>
-          <w:sz w:val="16"/>
-          <w:szCs w:val="16"/>
-        </w:rPr>
-        <w:t>.</w:t>
-      </w:r>
-      <w:proofErr w:type="gramStart"/>
-      <w:r>
-        <w:rPr>
-          <w:rFonts w:ascii="Arial" w:hAnsi="Arial" w:cs="Arial"/>
-          <w:sz w:val="16"/>
-          <w:szCs w:val="16"/>
-        </w:rPr>
-        <w:t>split</w:t>
-      </w:r>
-      <w:proofErr w:type="spellEnd"/>
-      <w:r>
-        <w:rPr>
-          <w:rFonts w:ascii="Arial" w:hAnsi="Arial" w:cs="Arial"/>
-          <w:sz w:val="16"/>
-          <w:szCs w:val="16"/>
-        </w:rPr>
-        <w:t>(</w:t>
-      </w:r>
-      <w:proofErr w:type="gramEnd"/>
-      <w:r>
-        <w:rPr>
-          <w:rFonts w:ascii="Arial" w:hAnsi="Arial" w:cs="Arial"/>
-          <w:sz w:val="16"/>
-          <w:szCs w:val="16"/>
-        </w:rPr>
-        <w:t xml:space="preserve">) keinen Dateipfad entgegennimmt und </w:t>
-      </w:r>
-      <w:r>
-        <w:rPr>
-          <w:rFonts w:ascii="Arial" w:hAnsi="Arial" w:cs="Arial"/>
-          <w:sz w:val="16"/>
-          <w:szCs w:val="16"/>
-        </w:rPr>
-        <w:br/>
-        <w:t xml:space="preserve">daraus eine Liste der Strings für die einzelnen Ordner zurückgibt. Für diesen </w:t>
-      </w:r>
-      <w:r>
-        <w:rPr>
-          <w:rFonts w:ascii="Arial" w:hAnsi="Arial" w:cs="Arial"/>
-          <w:sz w:val="16"/>
-          <w:szCs w:val="16"/>
-        </w:rPr>
-        <w:br/>
-        <w:t xml:space="preserve">Zweck müssen Sie den Pfad mit der </w:t>
-      </w:r>
-      <w:proofErr w:type="spellStart"/>
-      <w:r>
-        <w:rPr>
-          <w:rFonts w:ascii="Arial" w:hAnsi="Arial" w:cs="Arial"/>
-          <w:sz w:val="16"/>
-          <w:szCs w:val="16"/>
-        </w:rPr>
-        <w:t>Stringmethode</w:t>
-      </w:r>
-      <w:proofErr w:type="spellEnd"/>
-      <w:r>
-        <w:rPr>
-          <w:rFonts w:ascii="Arial" w:hAnsi="Arial" w:cs="Arial"/>
-          <w:sz w:val="16"/>
-          <w:szCs w:val="16"/>
-        </w:rPr>
-        <w:t xml:space="preserve"> </w:t>
-      </w:r>
-      <w:proofErr w:type="spellStart"/>
-      <w:proofErr w:type="gramStart"/>
-      <w:r>
-        <w:rPr>
-          <w:rFonts w:ascii="Arial" w:hAnsi="Arial" w:cs="Arial"/>
-          <w:sz w:val="16"/>
-          <w:szCs w:val="16"/>
-        </w:rPr>
-        <w:t>split</w:t>
-      </w:r>
-      <w:proofErr w:type="spellEnd"/>
-      <w:r>
-        <w:rPr>
-          <w:rFonts w:ascii="Arial" w:hAnsi="Arial" w:cs="Arial"/>
-          <w:sz w:val="16"/>
-          <w:szCs w:val="16"/>
-        </w:rPr>
-        <w:t>(</w:t>
-      </w:r>
-      <w:proofErr w:type="gramEnd"/>
-      <w:r>
-        <w:rPr>
-          <w:rFonts w:ascii="Arial" w:hAnsi="Arial" w:cs="Arial"/>
-          <w:sz w:val="16"/>
-          <w:szCs w:val="16"/>
-        </w:rPr>
-        <w:t xml:space="preserve">) zerlegen und ihr die </w:t>
-      </w:r>
-      <w:r>
-        <w:rPr>
-          <w:rFonts w:ascii="Arial" w:hAnsi="Arial" w:cs="Arial"/>
-          <w:sz w:val="16"/>
-          <w:szCs w:val="16"/>
-        </w:rPr>
         <w:br/>
         <w:t xml:space="preserve">Variable </w:t>
       </w:r>
-      <w:proofErr w:type="spellStart"/>
       <w:r>
         <w:rPr>
           <w:rFonts w:ascii="Arial" w:hAnsi="Arial" w:cs="Arial"/>
@@ -1357,7 +789,6 @@
         </w:rPr>
         <w:t>os.path.sep</w:t>
       </w:r>
-      <w:proofErr w:type="spellEnd"/>
       <w:r>
         <w:rPr>
           <w:rFonts w:ascii="Arial" w:hAnsi="Arial" w:cs="Arial"/>
@@ -1381,666 +812,240 @@
     </w:p>
     <w:p>
       <w:r>
-        <w:t>Die Methode `</w:t>
-      </w:r>
-      <w:proofErr w:type="spellStart"/>
-      <w:r>
-        <w:t>Path.chmod</w:t>
-      </w:r>
-      <w:proofErr w:type="spellEnd"/>
-      <w:proofErr w:type="gramStart"/>
-      <w:r>
-        <w:t>()`</w:t>
-      </w:r>
-      <w:proofErr w:type="gramEnd"/>
-      <w:r>
-        <w:t xml:space="preserve"> in der `</w:t>
-      </w:r>
-      <w:proofErr w:type="spellStart"/>
-      <w:r>
-        <w:t>pathlib</w:t>
-      </w:r>
-      <w:proofErr w:type="spellEnd"/>
-      <w:r>
-        <w:t>`-Bibliothek wird verwendet, um die Berechtigungen (Zugriffsrechte) einer Datei oder eines Verzeichnisses zu ändern. Diese Methode ist eine Entsprechung zu `</w:t>
-      </w:r>
-      <w:proofErr w:type="spellStart"/>
-      <w:r>
-        <w:t>os.chmod</w:t>
-      </w:r>
-      <w:proofErr w:type="spellEnd"/>
-      <w:r>
-        <w:t>()` und ermöglicht es dir, die Zugriffsrechte auf Dateien und Verzeichnisse zu setzen, indem du den entsprechenden Berechtigungsmodus angibst.</w:t>
-      </w:r>
-      <w:r>
-        <w:br/>
-      </w:r>
-      <w:r>
-        <w:br/>
-        <w:t>### Verwendung von `</w:t>
-      </w:r>
-      <w:proofErr w:type="spellStart"/>
-      <w:r>
-        <w:t>Path.chmod</w:t>
-      </w:r>
-      <w:proofErr w:type="spellEnd"/>
-      <w:proofErr w:type="gramStart"/>
-      <w:r>
-        <w:t>()`</w:t>
-      </w:r>
-      <w:proofErr w:type="gramEnd"/>
-      <w:r>
-        <w:br/>
+        <w:t>Die Methode `Path.chmod()` in der `pathlib`-Bibliothek wird verwendet, um die Berechtigungen (Zugriffsrechte) einer Datei oder eines Verzeichnisses zu ändern. Diese Methode ist eine Entsprechung zu `os.chmod()` und ermöglicht es dir, die Zugriffsrechte auf Dateien und Verzeichnisse zu setzen, indem du den entsprechenden Berechtigungsmodus angibst.</w:t>
+      </w:r>
+      <w:r>
+        <w:br/>
+      </w:r>
+      <w:r>
+        <w:br/>
+        <w:t>### Verwendung von `Path.chmod()`</w:t>
+      </w:r>
+      <w:r>
+        <w:br/>
+      </w:r>
+      <w:r>
+        <w:br/>
+        <w:t>```python</w:t>
+      </w:r>
+      <w:r>
+        <w:br/>
+        <w:t>from pathlib import Path</w:t>
+      </w:r>
+      <w:r>
+        <w:br/>
+      </w:r>
+      <w:r>
+        <w:br/>
+        <w:t># Definiere den Pfad zur Datei</w:t>
+      </w:r>
+      <w:r>
+        <w:br/>
+      </w:r>
+      <w:r>
+        <w:lastRenderedPageBreak/>
+        <w:t>path = Path('example.txt')</w:t>
+      </w:r>
+      <w:r>
+        <w:br/>
+      </w:r>
+      <w:r>
+        <w:br/>
+        <w:t># Ändere die Berechtigungen auf 0o644 (rw-r--r--)</w:t>
+      </w:r>
+      <w:r>
+        <w:br/>
+        <w:t>path.chmod(0o644)</w:t>
       </w:r>
       <w:r>
         <w:br/>
         <w:t>```</w:t>
       </w:r>
-      <w:proofErr w:type="spellStart"/>
-      <w:r>
-        <w:t>python</w:t>
-      </w:r>
-      <w:proofErr w:type="spellEnd"/>
-      <w:r>
-        <w:br/>
-      </w:r>
-      <w:proofErr w:type="spellStart"/>
-      <w:r>
-        <w:t>from</w:t>
-      </w:r>
-      <w:proofErr w:type="spellEnd"/>
-      <w:r>
-        <w:t xml:space="preserve"> </w:t>
-      </w:r>
-      <w:proofErr w:type="spellStart"/>
-      <w:r>
-        <w:t>pathlib</w:t>
-      </w:r>
-      <w:proofErr w:type="spellEnd"/>
-      <w:r>
-        <w:t xml:space="preserve"> </w:t>
-      </w:r>
-      <w:proofErr w:type="spellStart"/>
-      <w:r>
-        <w:t>import</w:t>
-      </w:r>
-      <w:proofErr w:type="spellEnd"/>
-      <w:r>
-        <w:t xml:space="preserve"> Path</w:t>
-      </w:r>
-      <w:r>
-        <w:br/>
-      </w:r>
-      <w:r>
-        <w:br/>
-        <w:t xml:space="preserve"># </w:t>
-      </w:r>
-      <w:proofErr w:type="gramStart"/>
-      <w:r>
-        <w:t>Definiere</w:t>
-      </w:r>
-      <w:proofErr w:type="gramEnd"/>
-      <w:r>
-        <w:t xml:space="preserve"> den Pfad zur Datei</w:t>
-      </w:r>
-      <w:r>
-        <w:br/>
-      </w:r>
-      <w:proofErr w:type="spellStart"/>
+      <w:r>
+        <w:br/>
+      </w:r>
+      <w:r>
+        <w:br/>
+        <w:t>### Parameter:</w:t>
+      </w:r>
+      <w:r>
+        <w:br/>
+      </w:r>
+      <w:r>
+        <w:br/>
+        <w:t>- **`mode`**: Der Modus ist eine Ganzzahl, die die Berechtigungen in Oktalnotation angibt. Zum Beispiel:</w:t>
+      </w:r>
+      <w:r>
+        <w:br/>
+        <w:t xml:space="preserve">  </w:t>
+      </w:r>
+      <w:r>
+        <w:rPr>
+          <w:highlight w:val="lightGray"/>
+        </w:rPr>
+        <w:t>- `0o644`: Lese- und Schreibrechte für den Eigentümer, nur Leserechte für andere.</w:t>
+      </w:r>
+      <w:r>
+        <w:rPr>
+          <w:highlight w:val="lightGray"/>
+        </w:rPr>
+        <w:br/>
+        <w:t xml:space="preserve">  - `0o755`: Lese-, Schreib- und Ausführungsrechte für den Eigentümer, Lese- und Ausführungsrechte für andere.</w:t>
+      </w:r>
+      <w:r>
+        <w:rPr>
+          <w:highlight w:val="lightGray"/>
+        </w:rPr>
+        <w:br/>
+        <w:t xml:space="preserve">  - `0o700`: Lese-, Schreib- und Ausführungsrechte nur für den Eigentümer.</w:t>
+      </w:r>
+      <w:r>
+        <w:br/>
+      </w:r>
+      <w:r>
+        <w:br/>
+        <w:t>### Beispiel</w:t>
+      </w:r>
+      <w:r>
+        <w:br/>
+      </w:r>
+      <w:r>
+        <w:br/>
+        <w:t>Hier ist ein vollständiges Beispiel zur Verwendung von `Path.chmod()`:</w:t>
+      </w:r>
+      <w:r>
+        <w:br/>
+      </w:r>
+      <w:r>
+        <w:br/>
+        <w:t>```python</w:t>
+      </w:r>
+      <w:r>
+        <w:br/>
+        <w:t>from pathlib import Path</w:t>
+      </w:r>
+      <w:r>
+        <w:br/>
+      </w:r>
+      <w:r>
+        <w:br/>
+        <w:t># Erstelle eine Testdatei</w:t>
+      </w:r>
+      <w:r>
+        <w:br/>
+        <w:t>path = Path('example.txt')</w:t>
+      </w:r>
+      <w:r>
+        <w:br/>
+        <w:t>path.write_text('Dies ist ein Test.')</w:t>
+      </w:r>
+      <w:r>
+        <w:br/>
+      </w:r>
+      <w:r>
+        <w:br/>
+        <w:t># Ändere die Berechtigungen der Datei</w:t>
+      </w:r>
+      <w:r>
+        <w:br/>
+        <w:t>print(f"Vorherige Berechtigungen: {oct(path.stat().st_mode &amp; 0o777)}")</w:t>
+      </w:r>
+      <w:r>
+        <w:br/>
+        <w:t>path.chmod(0o600)  # Nur Lese- und Schreibrechte für den Eigentümer</w:t>
+      </w:r>
+      <w:r>
+        <w:br/>
+        <w:t>print(f"Nachherige Berechtigungen: {oct(path.stat().st_mode &amp; 0o777)}")</w:t>
+      </w:r>
+      <w:r>
+        <w:br/>
+        <w:t>```</w:t>
+      </w:r>
+      <w:r>
+        <w:br/>
+      </w:r>
+      <w:r>
+        <w:br/>
+        <w:t>In diesem Beispiel:</w:t>
+      </w:r>
+      <w:r>
+        <w:br/>
+      </w:r>
+      <w:r>
+        <w:br/>
+        <w:t>1. Eine Datei `example.txt` wird erstellt.</w:t>
+      </w:r>
+      <w:r>
+        <w:br/>
+        <w:t>2. Die Berechtigungen der Datei werden vor und nach der Verwendung von `chmod()` ausgedruckt.</w:t>
+      </w:r>
+      <w:r>
+        <w:br/>
+        <w:t>3. `0o600` setzt die Berechtigungen so, dass nur der Eigentümer Lese- und Schreibrechte hat.</w:t>
+      </w:r>
+      <w:r>
+        <w:br/>
+      </w:r>
+      <w:r>
+        <w:br/>
+        <w:t>### Wichtige Punkte:</w:t>
+      </w:r>
+      <w:r>
+        <w:br/>
+      </w:r>
+      <w:r>
+        <w:br/>
+        <w:t>- **Zugriffsrechte**: Die Berechtigungen werden in Oktalnotation angegeben. Zum Beispiel steht `0o644` für Lese- und Schreibrechte des Eigentümers und nur Leserechte für andere.</w:t>
+      </w:r>
+      <w:r>
+        <w:br/>
+        <w:t>- **Berechtigungsänderungen**: `chmod()` funktioniert nur bei Dateien und Verzeichnissen, die im Dateisystem existieren.</w:t>
+      </w:r>
+      <w:r>
+        <w:br/>
+        <w:t>- **Plattformabhängigkeit**: `chmod()` funktioniert in der Regel auf Unix-ähnlichen Systemen (wie Linux und macOS). Auf Windows-Systemen werden Berechtigungen anders gehandhabt, und `chmod()` hat möglicherweise eine eingeschränkte Wirkung.</w:t>
+      </w:r>
+      <w:r>
+        <w:br/>
+      </w:r>
+      <w:r>
+        <w:br/>
+      </w:r>
       <w:r>
         <w:lastRenderedPageBreak/>
-        <w:t>path</w:t>
-      </w:r>
-      <w:proofErr w:type="spellEnd"/>
-      <w:r>
-        <w:t xml:space="preserve"> = Path('example.txt')</w:t>
-      </w:r>
-      <w:r>
-        <w:br/>
-      </w:r>
-      <w:r>
-        <w:br/>
-        <w:t xml:space="preserve"># </w:t>
-      </w:r>
-      <w:proofErr w:type="gramStart"/>
-      <w:r>
-        <w:t>Ändere</w:t>
-      </w:r>
-      <w:proofErr w:type="gramEnd"/>
-      <w:r>
-        <w:t xml:space="preserve"> die Berechtigungen auf 0o644 (</w:t>
-      </w:r>
-      <w:proofErr w:type="spellStart"/>
-      <w:r>
-        <w:t>rw</w:t>
-      </w:r>
-      <w:proofErr w:type="spellEnd"/>
-      <w:r>
-        <w:t>-r--r--)</w:t>
-      </w:r>
-      <w:r>
-        <w:br/>
-      </w:r>
-      <w:proofErr w:type="spellStart"/>
-      <w:proofErr w:type="gramStart"/>
-      <w:r>
-        <w:t>path.chmod</w:t>
-      </w:r>
-      <w:proofErr w:type="spellEnd"/>
-      <w:proofErr w:type="gramEnd"/>
-      <w:r>
-        <w:t>(0o644)</w:t>
-      </w:r>
-      <w:r>
-        <w:br/>
-        <w:t>```</w:t>
-      </w:r>
-      <w:r>
-        <w:br/>
-      </w:r>
-      <w:r>
-        <w:br/>
-        <w:t>### Parameter:</w:t>
-      </w:r>
-      <w:r>
-        <w:br/>
-      </w:r>
-      <w:r>
-        <w:br/>
-        <w:t>- **`</w:t>
-      </w:r>
-      <w:proofErr w:type="spellStart"/>
-      <w:r>
-        <w:t>mode</w:t>
-      </w:r>
-      <w:proofErr w:type="spellEnd"/>
-      <w:r>
-        <w:t xml:space="preserve">`**: Der Modus ist eine Ganzzahl, die die Berechtigungen in </w:t>
-      </w:r>
-      <w:proofErr w:type="spellStart"/>
-      <w:r>
-        <w:t>Oktalnotation</w:t>
-      </w:r>
-      <w:proofErr w:type="spellEnd"/>
-      <w:r>
-        <w:t xml:space="preserve"> angibt. Zum Beispiel:</w:t>
-      </w:r>
-      <w:r>
-        <w:br/>
-        <w:t xml:space="preserve">  </w:t>
-      </w:r>
-      <w:r>
-        <w:rPr>
-          <w:highlight w:val="lightGray"/>
-        </w:rPr>
-        <w:t>- `0o644`: Lese- und Schreibrechte für den Eigentümer, nur Leserechte für andere.</w:t>
-      </w:r>
-      <w:r>
-        <w:rPr>
-          <w:highlight w:val="lightGray"/>
-        </w:rPr>
-        <w:br/>
-        <w:t xml:space="preserve">  - `0o755`: Lese-, Schreib- und Ausführungsrechte für den Eigentümer, Lese- und Ausführungsrechte für andere.</w:t>
-      </w:r>
-      <w:r>
-        <w:rPr>
-          <w:highlight w:val="lightGray"/>
-        </w:rPr>
-        <w:br/>
-        <w:t xml:space="preserve">  - `0o700`: Lese-, Schreib- und Ausführungsrechte nur für den Eigentümer.</w:t>
-      </w:r>
-      <w:r>
-        <w:br/>
-      </w:r>
-      <w:r>
-        <w:br/>
-        <w:t>### Beispiel</w:t>
-      </w:r>
-      <w:r>
-        <w:br/>
-      </w:r>
-      <w:r>
-        <w:br/>
-        <w:t>Hier ist ein vollständiges Beispiel zur Verwendung von `</w:t>
-      </w:r>
-      <w:proofErr w:type="spellStart"/>
-      <w:r>
-        <w:t>Path.chmod</w:t>
-      </w:r>
-      <w:proofErr w:type="spellEnd"/>
-      <w:r>
-        <w:t>()`:</w:t>
-      </w:r>
-      <w:r>
-        <w:br/>
-      </w:r>
-      <w:r>
-        <w:br/>
-        <w:t>```</w:t>
-      </w:r>
-      <w:proofErr w:type="spellStart"/>
-      <w:r>
-        <w:t>python</w:t>
-      </w:r>
-      <w:proofErr w:type="spellEnd"/>
-      <w:r>
-        <w:br/>
-      </w:r>
-      <w:proofErr w:type="spellStart"/>
-      <w:r>
-        <w:t>from</w:t>
-      </w:r>
-      <w:proofErr w:type="spellEnd"/>
-      <w:r>
-        <w:t xml:space="preserve"> </w:t>
-      </w:r>
-      <w:proofErr w:type="spellStart"/>
-      <w:r>
-        <w:t>pathlib</w:t>
-      </w:r>
-      <w:proofErr w:type="spellEnd"/>
-      <w:r>
-        <w:t xml:space="preserve"> </w:t>
-      </w:r>
-      <w:proofErr w:type="spellStart"/>
-      <w:r>
-        <w:t>import</w:t>
-      </w:r>
-      <w:proofErr w:type="spellEnd"/>
-      <w:r>
-        <w:t xml:space="preserve"> Path</w:t>
-      </w:r>
-      <w:r>
-        <w:br/>
-      </w:r>
-      <w:r>
-        <w:br/>
-        <w:t># Erstelle eine Testdatei</w:t>
-      </w:r>
-      <w:r>
-        <w:br/>
-      </w:r>
-      <w:proofErr w:type="spellStart"/>
-      <w:r>
-        <w:t>path</w:t>
-      </w:r>
-      <w:proofErr w:type="spellEnd"/>
-      <w:r>
-        <w:t xml:space="preserve"> = Path('example.txt')</w:t>
-      </w:r>
-      <w:r>
-        <w:br/>
-      </w:r>
-      <w:proofErr w:type="spellStart"/>
-      <w:r>
-        <w:t>path.write_text</w:t>
-      </w:r>
-      <w:proofErr w:type="spellEnd"/>
-      <w:r>
-        <w:t>('Dies ist ein Test.')</w:t>
-      </w:r>
-      <w:r>
-        <w:br/>
-      </w:r>
-      <w:r>
-        <w:br/>
-        <w:t># Ändere die Berechtigungen der Datei</w:t>
-      </w:r>
-      <w:r>
-        <w:br/>
-      </w:r>
-      <w:proofErr w:type="spellStart"/>
-      <w:r>
-        <w:t>print</w:t>
-      </w:r>
-      <w:proofErr w:type="spellEnd"/>
-      <w:r>
-        <w:t>(</w:t>
-      </w:r>
-      <w:proofErr w:type="spellStart"/>
-      <w:r>
-        <w:t>f"Vorherige</w:t>
-      </w:r>
-      <w:proofErr w:type="spellEnd"/>
-      <w:r>
-        <w:t xml:space="preserve"> Berechtigungen: {</w:t>
-      </w:r>
-      <w:proofErr w:type="spellStart"/>
-      <w:r>
-        <w:t>oct</w:t>
-      </w:r>
-      <w:proofErr w:type="spellEnd"/>
-      <w:r>
-        <w:t>(</w:t>
-      </w:r>
-      <w:proofErr w:type="spellStart"/>
-      <w:r>
-        <w:t>path.stat</w:t>
-      </w:r>
-      <w:proofErr w:type="spellEnd"/>
-      <w:r>
-        <w:t>().</w:t>
-      </w:r>
-      <w:proofErr w:type="spellStart"/>
-      <w:r>
-        <w:t>st_mode</w:t>
-      </w:r>
-      <w:proofErr w:type="spellEnd"/>
-      <w:r>
-        <w:t xml:space="preserve"> &amp; 0o777)}")</w:t>
-      </w:r>
-      <w:r>
-        <w:br/>
-      </w:r>
-      <w:proofErr w:type="spellStart"/>
-      <w:r>
-        <w:t>path.chmod</w:t>
-      </w:r>
-      <w:proofErr w:type="spellEnd"/>
-      <w:r>
-        <w:t>(0o600)  # Nur Lese- und Schreibrechte für den Eigentümer</w:t>
-      </w:r>
-      <w:r>
-        <w:br/>
-      </w:r>
-      <w:proofErr w:type="spellStart"/>
-      <w:r>
-        <w:t>print</w:t>
-      </w:r>
-      <w:proofErr w:type="spellEnd"/>
-      <w:r>
-        <w:t>(</w:t>
-      </w:r>
-      <w:proofErr w:type="spellStart"/>
-      <w:r>
-        <w:t>f"Nachherige</w:t>
-      </w:r>
-      <w:proofErr w:type="spellEnd"/>
-      <w:r>
-        <w:t xml:space="preserve"> Berechtigungen: {</w:t>
-      </w:r>
-      <w:proofErr w:type="spellStart"/>
-      <w:r>
-        <w:t>oct</w:t>
-      </w:r>
-      <w:proofErr w:type="spellEnd"/>
-      <w:r>
-        <w:t>(</w:t>
-      </w:r>
-      <w:proofErr w:type="spellStart"/>
-      <w:r>
-        <w:t>path.stat</w:t>
-      </w:r>
-      <w:proofErr w:type="spellEnd"/>
-      <w:r>
-        <w:t>().</w:t>
-      </w:r>
-      <w:proofErr w:type="spellStart"/>
-      <w:r>
-        <w:t>st_mode</w:t>
-      </w:r>
-      <w:proofErr w:type="spellEnd"/>
-      <w:r>
-        <w:t xml:space="preserve"> &amp; 0o777)}")</w:t>
-      </w:r>
-      <w:r>
-        <w:br/>
-        <w:t>```</w:t>
-      </w:r>
-      <w:r>
-        <w:br/>
-      </w:r>
-      <w:r>
-        <w:br/>
-        <w:t>In diesem Beispiel:</w:t>
-      </w:r>
-      <w:r>
-        <w:br/>
-      </w:r>
-      <w:r>
-        <w:br/>
-        <w:t>1. Eine Datei `example.txt` wird erstellt.</w:t>
-      </w:r>
-      <w:r>
-        <w:br/>
-        <w:t>2. Die Berechtigungen der Datei werden vor und nach der Verwendung von `</w:t>
-      </w:r>
-      <w:proofErr w:type="spellStart"/>
-      <w:proofErr w:type="gramStart"/>
-      <w:r>
-        <w:t>chmod</w:t>
-      </w:r>
-      <w:proofErr w:type="spellEnd"/>
-      <w:r>
-        <w:t>(</w:t>
-      </w:r>
-      <w:proofErr w:type="gramEnd"/>
-      <w:r>
-        <w:t>)` ausgedruckt.</w:t>
-      </w:r>
-      <w:r>
-        <w:br/>
-        <w:t>3. `0o600` setzt die Berechtigungen so, dass nur der Eigentümer Lese- und Schreibrechte hat.</w:t>
-      </w:r>
-      <w:r>
-        <w:br/>
-      </w:r>
-      <w:r>
-        <w:br/>
-        <w:t>### Wichtige Punkte:</w:t>
-      </w:r>
-      <w:r>
-        <w:br/>
-      </w:r>
-      <w:r>
-        <w:br/>
-        <w:t xml:space="preserve">- **Zugriffsrechte**: Die Berechtigungen werden in </w:t>
-      </w:r>
-      <w:proofErr w:type="spellStart"/>
-      <w:r>
-        <w:t>Oktalnotation</w:t>
-      </w:r>
-      <w:proofErr w:type="spellEnd"/>
-      <w:r>
-        <w:t xml:space="preserve"> angegeben. Zum Beispiel steht `0o644` für Lese- und Schreibrechte des Eigentümers und nur Leserechte für andere.</w:t>
-      </w:r>
-      <w:r>
-        <w:br/>
-        <w:t>- **Berechtigungsänderungen**: `</w:t>
-      </w:r>
-      <w:proofErr w:type="spellStart"/>
-      <w:proofErr w:type="gramStart"/>
-      <w:r>
-        <w:t>chmod</w:t>
-      </w:r>
-      <w:proofErr w:type="spellEnd"/>
-      <w:r>
-        <w:t>(</w:t>
-      </w:r>
-      <w:proofErr w:type="gramEnd"/>
-      <w:r>
-        <w:t>)` funktioniert nur bei Dateien und Verzeichnissen, die im Dateisystem existieren.</w:t>
-      </w:r>
-      <w:r>
-        <w:br/>
-        <w:t>- **Plattformabhängigkeit**: `</w:t>
-      </w:r>
-      <w:proofErr w:type="spellStart"/>
-      <w:proofErr w:type="gramStart"/>
-      <w:r>
-        <w:t>chmod</w:t>
-      </w:r>
-      <w:proofErr w:type="spellEnd"/>
-      <w:r>
-        <w:t>(</w:t>
-      </w:r>
-      <w:proofErr w:type="gramEnd"/>
-      <w:r>
-        <w:t xml:space="preserve">)` funktioniert in der Regel auf Unix-ähnlichen Systemen (wie Linux und </w:t>
-      </w:r>
-      <w:proofErr w:type="spellStart"/>
-      <w:r>
-        <w:t>macOS</w:t>
-      </w:r>
-      <w:proofErr w:type="spellEnd"/>
-      <w:r>
-        <w:t>). Auf Windows-Systemen werden Berechtigungen anders gehandhabt, und `</w:t>
-      </w:r>
-      <w:proofErr w:type="spellStart"/>
-      <w:proofErr w:type="gramStart"/>
-      <w:r>
-        <w:t>chmod</w:t>
-      </w:r>
-      <w:proofErr w:type="spellEnd"/>
-      <w:r>
-        <w:t>(</w:t>
-      </w:r>
-      <w:proofErr w:type="gramEnd"/>
-      <w:r>
-        <w:t>)` hat möglicherweise eine eingeschränkte Wirkung.</w:t>
-      </w:r>
-      <w:r>
-        <w:br/>
-      </w:r>
-      <w:r>
-        <w:br/>
-      </w:r>
-      <w:r>
-        <w:lastRenderedPageBreak/>
-        <w:t>Die Methode `</w:t>
-      </w:r>
-      <w:proofErr w:type="spellStart"/>
-      <w:r>
-        <w:t>Path.chmod</w:t>
-      </w:r>
-      <w:proofErr w:type="spellEnd"/>
-      <w:proofErr w:type="gramStart"/>
-      <w:r>
-        <w:t>()`</w:t>
-      </w:r>
-      <w:proofErr w:type="gramEnd"/>
-      <w:r>
-        <w:t xml:space="preserve"> bietet eine objektorientierte Möglichkeit, Dateiberechtigungen zu ändern, und integriert sich nahtlos in die `</w:t>
-      </w:r>
-      <w:proofErr w:type="spellStart"/>
-      <w:r>
-        <w:t>pathlib</w:t>
-      </w:r>
-      <w:proofErr w:type="spellEnd"/>
-      <w:r>
-        <w:t>`-Bibliothek, die für die Arbeit mit Pfaden und Dateien in Python entwickelt wurde.</w:t>
-      </w:r>
-      <w:r>
-        <w:br/>
-      </w:r>
-    </w:p>
-    <w:p>
-      <w:proofErr w:type="spellStart"/>
-      <w:r>
-        <w:t>pathlib</w:t>
-      </w:r>
-      <w:proofErr w:type="spellEnd"/>
-      <w:r>
-        <w:t xml:space="preserve"> bietet eine Methode zur Bestimmung der Größe einer Datei, die der Funktion </w:t>
-      </w:r>
-      <w:proofErr w:type="spellStart"/>
-      <w:proofErr w:type="gramStart"/>
-      <w:r>
-        <w:t>os.path</w:t>
-      </w:r>
-      <w:proofErr w:type="gramEnd"/>
-      <w:r>
-        <w:t>.</w:t>
-      </w:r>
-      <w:proofErr w:type="gramStart"/>
-      <w:r>
-        <w:t>getsize</w:t>
-      </w:r>
-      <w:proofErr w:type="spellEnd"/>
-      <w:r>
-        <w:t>(</w:t>
-      </w:r>
-      <w:proofErr w:type="gramEnd"/>
-      <w:r>
-        <w:t>) entspricht.</w:t>
-      </w:r>
-    </w:p>
-    <w:p>
-      <w:r>
-        <w:t xml:space="preserve">In </w:t>
-      </w:r>
-      <w:proofErr w:type="spellStart"/>
-      <w:r>
-        <w:t>pathlib</w:t>
-      </w:r>
-      <w:proofErr w:type="spellEnd"/>
-      <w:r>
-        <w:t xml:space="preserve"> kannst du die </w:t>
-      </w:r>
-      <w:proofErr w:type="gramStart"/>
-      <w:r>
-        <w:t xml:space="preserve">Methode </w:t>
+        <w:t>Die Methode `Path.chmod()` bietet eine objektorientierte Möglichkeit, Dateiberechtigungen zu ändern, und integriert sich nahtlos in die `pathlib`-Bibliothek, die für die Arbeit mit Pfaden und Dateien in Python entwickelt wurde.</w:t>
+      </w:r>
+      <w:r>
+        <w:br/>
+      </w:r>
+    </w:p>
+    <w:p>
+      <w:r>
+        <w:t>pathlib bietet eine Methode zur Bestimmung der Größe einer Datei, die der Funktion os.path.getsize() entspricht.</w:t>
+      </w:r>
+    </w:p>
+    <w:p>
+      <w:r>
+        <w:t xml:space="preserve">In pathlib kannst du die Methode </w:t>
       </w:r>
       <w:r>
         <w:rPr>
           <w:b/>
         </w:rPr>
-        <w:t>.</w:t>
-      </w:r>
-      <w:proofErr w:type="spellStart"/>
+        <w:t>.stat()</w:t>
+      </w:r>
+      <w:r>
+        <w:t xml:space="preserve"> verwenden, um verschiedene Dateieigenschaften abzurufen, einschließlich der Größe der Datei. Die Größe wird im Attribut </w:t>
+      </w:r>
       <w:r>
         <w:rPr>
           <w:b/>
         </w:rPr>
-        <w:t>stat</w:t>
-      </w:r>
-      <w:proofErr w:type="spellEnd"/>
-      <w:proofErr w:type="gramEnd"/>
-      <w:r>
-        <w:rPr>
-          <w:b/>
-        </w:rPr>
-        <w:t>()</w:t>
-      </w:r>
-      <w:r>
-        <w:t xml:space="preserve"> verwenden, um verschiedene Dateieigenschaften abzurufen, einschließlich der Größe der Datei. Die Größe wird im Attribut </w:t>
-      </w:r>
-      <w:proofErr w:type="spellStart"/>
-      <w:r>
-        <w:rPr>
-          <w:b/>
-        </w:rPr>
         <w:t>st_size</w:t>
       </w:r>
-      <w:proofErr w:type="spellEnd"/>
-      <w:r>
-        <w:t xml:space="preserve"> des </w:t>
-      </w:r>
-      <w:proofErr w:type="spellStart"/>
-      <w:proofErr w:type="gramStart"/>
-      <w:r>
-        <w:t>os.stat</w:t>
-      </w:r>
-      <w:proofErr w:type="gramEnd"/>
-      <w:r>
-        <w:t>_result</w:t>
-      </w:r>
-      <w:proofErr w:type="spellEnd"/>
-      <w:r>
-        <w:t xml:space="preserve">-Objekts gespeichert, das </w:t>
-      </w:r>
-      <w:proofErr w:type="gramStart"/>
-      <w:r>
-        <w:t>von .</w:t>
-      </w:r>
-      <w:proofErr w:type="spellStart"/>
-      <w:r>
-        <w:t>stat</w:t>
-      </w:r>
-      <w:proofErr w:type="spellEnd"/>
-      <w:proofErr w:type="gramEnd"/>
-      <w:r>
-        <w:t>() zurückgegeben wird.</w:t>
+      <w:r>
+        <w:t xml:space="preserve"> des os.stat_result-Objekts gespeichert, das von .stat() zurückgegeben wird.</w:t>
       </w:r>
     </w:p>
     <w:p/>
@@ -2077,16 +1082,8 @@
         <w:rPr>
           <w:b/>
         </w:rPr>
-        <w:t xml:space="preserve"> </w:t>
-      </w:r>
-      <w:proofErr w:type="spellStart"/>
-      <w:r>
-        <w:rPr>
-          <w:b/>
-        </w:rPr>
-        <w:t>traceback</w:t>
-      </w:r>
-      <w:proofErr w:type="spellEnd"/>
+        <w:t xml:space="preserve"> traceback</w:t>
+      </w:r>
       <w:r>
         <w:t>:</w:t>
       </w:r>
@@ -2125,23 +1122,23 @@
           <w:rFonts w:ascii="JetBrains Mono NL" w:hAnsi="JetBrains Mono NL" w:cs="JetBrains Mono NL"/>
           <w:lang w:val="en-US"/>
         </w:rPr>
-        <w:t xml:space="preserve"> raise </w:t>
-      </w:r>
-      <w:proofErr w:type="gramStart"/>
+        <w:t xml:space="preserve"> raise Exception('This is the error message.') </w:t>
+      </w:r>
       <w:r>
         <w:rPr>
           <w:rFonts w:ascii="JetBrains Mono NL" w:hAnsi="JetBrains Mono NL" w:cs="JetBrains Mono NL"/>
           <w:lang w:val="en-US"/>
         </w:rPr>
-        <w:t>Exception(</w:t>
-      </w:r>
-      <w:proofErr w:type="gramEnd"/>
+        <w:br/>
+        <w:t xml:space="preserve">except: </w:t>
+      </w:r>
       <w:r>
         <w:rPr>
           <w:rFonts w:ascii="JetBrains Mono NL" w:hAnsi="JetBrains Mono NL" w:cs="JetBrains Mono NL"/>
           <w:lang w:val="en-US"/>
         </w:rPr>
-        <w:t xml:space="preserve">'This is the error message.') </w:t>
+        <w:br/>
+        <w:t xml:space="preserve"> errorFile = open('errorInfo.txt', 'w') </w:t>
       </w:r>
       <w:r>
         <w:rPr>
@@ -2149,7 +1146,7 @@
           <w:lang w:val="en-US"/>
         </w:rPr>
         <w:br/>
-        <w:t xml:space="preserve">except: </w:t>
+        <w:t xml:space="preserve"> errorFile.write(traceback.format_exc()) </w:t>
       </w:r>
       <w:r>
         <w:rPr>
@@ -2157,249 +1154,54 @@
           <w:lang w:val="en-US"/>
         </w:rPr>
         <w:br/>
-        <w:t xml:space="preserve"> </w:t>
-      </w:r>
-      <w:proofErr w:type="spellStart"/>
+        <w:t xml:space="preserve"> errorFile.close() </w:t>
+      </w:r>
       <w:r>
         <w:rPr>
           <w:rFonts w:ascii="JetBrains Mono NL" w:hAnsi="JetBrains Mono NL" w:cs="JetBrains Mono NL"/>
           <w:lang w:val="en-US"/>
         </w:rPr>
-        <w:t>errorFile</w:t>
-      </w:r>
-      <w:proofErr w:type="spellEnd"/>
+        <w:br/>
+        <w:t xml:space="preserve"> print('The traceback info was written to errorInfo.txt.') </w:t>
+      </w:r>
       <w:r>
         <w:rPr>
           <w:rFonts w:ascii="JetBrains Mono NL" w:hAnsi="JetBrains Mono NL" w:cs="JetBrains Mono NL"/>
           <w:lang w:val="en-US"/>
         </w:rPr>
-        <w:t xml:space="preserve"> = </w:t>
-      </w:r>
-      <w:proofErr w:type="gramStart"/>
+        <w:br/>
+      </w:r>
       <w:r>
         <w:rPr>
           <w:rFonts w:ascii="JetBrains Mono NL" w:hAnsi="JetBrains Mono NL" w:cs="JetBrains Mono NL"/>
           <w:lang w:val="en-US"/>
         </w:rPr>
-        <w:t>open(</w:t>
-      </w:r>
-      <w:proofErr w:type="gramEnd"/>
-      <w:r>
-        <w:rPr>
-          <w:rFonts w:ascii="JetBrains Mono NL" w:hAnsi="JetBrains Mono NL" w:cs="JetBrains Mono NL"/>
+        <w:t># schreibt den traceback in die Datei “errorInfo.txt”</w:t>
+      </w:r>
+    </w:p>
+    <w:p>
+      <w:pPr>
+        <w:rPr>
           <w:lang w:val="en-US"/>
         </w:rPr>
-        <w:t xml:space="preserve">'errorInfo.txt', 'w') </w:t>
-      </w:r>
-      <w:r>
-        <w:rPr>
-          <w:rFonts w:ascii="JetBrains Mono NL" w:hAnsi="JetBrains Mono NL" w:cs="JetBrains Mono NL"/>
-          <w:lang w:val="en-US"/>
-        </w:rPr>
-        <w:br/>
-        <w:t xml:space="preserve"> </w:t>
-      </w:r>
-      <w:proofErr w:type="spellStart"/>
-      <w:r>
-        <w:rPr>
-          <w:rFonts w:ascii="JetBrains Mono NL" w:hAnsi="JetBrains Mono NL" w:cs="JetBrains Mono NL"/>
-          <w:lang w:val="en-US"/>
-        </w:rPr>
-        <w:t>errorFile.write</w:t>
-      </w:r>
-      <w:proofErr w:type="spellEnd"/>
-      <w:r>
-        <w:rPr>
-          <w:rFonts w:ascii="JetBrains Mono NL" w:hAnsi="JetBrains Mono NL" w:cs="JetBrains Mono NL"/>
-          <w:lang w:val="en-US"/>
-        </w:rPr>
-        <w:t>(</w:t>
-      </w:r>
-      <w:proofErr w:type="spellStart"/>
-      <w:proofErr w:type="gramStart"/>
-      <w:r>
-        <w:rPr>
-          <w:rFonts w:ascii="JetBrains Mono NL" w:hAnsi="JetBrains Mono NL" w:cs="JetBrains Mono NL"/>
-          <w:lang w:val="en-US"/>
-        </w:rPr>
-        <w:t>traceback.format</w:t>
-      </w:r>
-      <w:proofErr w:type="gramEnd"/>
-      <w:r>
-        <w:rPr>
-          <w:rFonts w:ascii="JetBrains Mono NL" w:hAnsi="JetBrains Mono NL" w:cs="JetBrains Mono NL"/>
-          <w:lang w:val="en-US"/>
-        </w:rPr>
-        <w:t>_</w:t>
-      </w:r>
-      <w:proofErr w:type="gramStart"/>
-      <w:r>
-        <w:rPr>
-          <w:rFonts w:ascii="JetBrains Mono NL" w:hAnsi="JetBrains Mono NL" w:cs="JetBrains Mono NL"/>
-          <w:lang w:val="en-US"/>
-        </w:rPr>
-        <w:t>exc</w:t>
-      </w:r>
-      <w:proofErr w:type="spellEnd"/>
-      <w:r>
-        <w:rPr>
-          <w:rFonts w:ascii="JetBrains Mono NL" w:hAnsi="JetBrains Mono NL" w:cs="JetBrains Mono NL"/>
-          <w:lang w:val="en-US"/>
-        </w:rPr>
-        <w:t>(</w:t>
-      </w:r>
-      <w:proofErr w:type="gramEnd"/>
-      <w:r>
-        <w:rPr>
-          <w:rFonts w:ascii="JetBrains Mono NL" w:hAnsi="JetBrains Mono NL" w:cs="JetBrains Mono NL"/>
-          <w:lang w:val="en-US"/>
-        </w:rPr>
-        <w:t xml:space="preserve">)) </w:t>
-      </w:r>
-      <w:r>
-        <w:rPr>
-          <w:rFonts w:ascii="JetBrains Mono NL" w:hAnsi="JetBrains Mono NL" w:cs="JetBrains Mono NL"/>
-          <w:lang w:val="en-US"/>
-        </w:rPr>
-        <w:br/>
-        <w:t xml:space="preserve"> </w:t>
-      </w:r>
-      <w:proofErr w:type="spellStart"/>
-      <w:r>
-        <w:rPr>
-          <w:rFonts w:ascii="JetBrains Mono NL" w:hAnsi="JetBrains Mono NL" w:cs="JetBrains Mono NL"/>
-          <w:lang w:val="en-US"/>
-        </w:rPr>
-        <w:t>errorFile.close</w:t>
-      </w:r>
-      <w:proofErr w:type="spellEnd"/>
-      <w:r>
-        <w:rPr>
-          <w:rFonts w:ascii="JetBrains Mono NL" w:hAnsi="JetBrains Mono NL" w:cs="JetBrains Mono NL"/>
-          <w:lang w:val="en-US"/>
-        </w:rPr>
-        <w:t xml:space="preserve">() </w:t>
-      </w:r>
-      <w:r>
-        <w:rPr>
-          <w:rFonts w:ascii="JetBrains Mono NL" w:hAnsi="JetBrains Mono NL" w:cs="JetBrains Mono NL"/>
-          <w:lang w:val="en-US"/>
-        </w:rPr>
-        <w:br/>
-        <w:t xml:space="preserve"> </w:t>
-      </w:r>
-      <w:proofErr w:type="gramStart"/>
-      <w:r>
-        <w:rPr>
-          <w:rFonts w:ascii="JetBrains Mono NL" w:hAnsi="JetBrains Mono NL" w:cs="JetBrains Mono NL"/>
-          <w:lang w:val="en-US"/>
-        </w:rPr>
-        <w:t>print(</w:t>
-      </w:r>
-      <w:proofErr w:type="gramEnd"/>
-      <w:r>
-        <w:rPr>
-          <w:rFonts w:ascii="JetBrains Mono NL" w:hAnsi="JetBrains Mono NL" w:cs="JetBrains Mono NL"/>
-          <w:lang w:val="en-US"/>
-        </w:rPr>
-        <w:t xml:space="preserve">'The traceback info was written to errorInfo.txt.') </w:t>
-      </w:r>
-      <w:r>
-        <w:rPr>
-          <w:rFonts w:ascii="JetBrains Mono NL" w:hAnsi="JetBrains Mono NL" w:cs="JetBrains Mono NL"/>
-          <w:lang w:val="en-US"/>
-        </w:rPr>
-        <w:br/>
-      </w:r>
-      <w:r>
-        <w:rPr>
-          <w:rFonts w:ascii="JetBrains Mono NL" w:hAnsi="JetBrains Mono NL" w:cs="JetBrains Mono NL"/>
-          <w:lang w:val="en-US"/>
-        </w:rPr>
-        <w:t xml:space="preserve"># </w:t>
-      </w:r>
-      <w:proofErr w:type="spellStart"/>
-      <w:r>
-        <w:rPr>
-          <w:rFonts w:ascii="JetBrains Mono NL" w:hAnsi="JetBrains Mono NL" w:cs="JetBrains Mono NL"/>
-          <w:lang w:val="en-US"/>
-        </w:rPr>
-        <w:t>schreibt</w:t>
-      </w:r>
-      <w:proofErr w:type="spellEnd"/>
-      <w:r>
-        <w:rPr>
-          <w:rFonts w:ascii="JetBrains Mono NL" w:hAnsi="JetBrains Mono NL" w:cs="JetBrains Mono NL"/>
-          <w:lang w:val="en-US"/>
-        </w:rPr>
-        <w:t xml:space="preserve"> den traceback in die </w:t>
-      </w:r>
-      <w:proofErr w:type="spellStart"/>
-      <w:r>
-        <w:rPr>
-          <w:rFonts w:ascii="JetBrains Mono NL" w:hAnsi="JetBrains Mono NL" w:cs="JetBrains Mono NL"/>
-          <w:lang w:val="en-US"/>
-        </w:rPr>
-        <w:t>Datei</w:t>
-      </w:r>
-      <w:proofErr w:type="spellEnd"/>
-      <w:r>
-        <w:rPr>
-          <w:rFonts w:ascii="JetBrains Mono NL" w:hAnsi="JetBrains Mono NL" w:cs="JetBrains Mono NL"/>
-          <w:lang w:val="en-US"/>
-        </w:rPr>
-        <w:t xml:space="preserve"> “errorInfo.txt”</w:t>
-      </w:r>
-    </w:p>
-    <w:p>
-      <w:pPr>
-        <w:rPr>
-          <w:lang w:val="en-US"/>
-        </w:rPr>
       </w:pPr>
     </w:p>
     <w:p>
-      <w:proofErr w:type="spellStart"/>
-      <w:r>
-        <w:t>assert</w:t>
-      </w:r>
-      <w:proofErr w:type="spellEnd"/>
-      <w:r>
-        <w:t xml:space="preserve"> </w:t>
-      </w:r>
-      <w:proofErr w:type="spellStart"/>
-      <w:r>
-        <w:t>prüf</w:t>
-      </w:r>
-      <w:r>
-        <w:t>ung_ob_True</w:t>
-      </w:r>
-      <w:proofErr w:type="spellEnd"/>
-      <w:r>
-        <w:t>, „Message“</w:t>
-      </w:r>
-      <w:r>
-        <w:br/>
-        <w:t>Zusicherungen(</w:t>
-      </w:r>
-      <w:proofErr w:type="spellStart"/>
-      <w:r>
-        <w:t>assert</w:t>
-      </w:r>
-      <w:proofErr w:type="spellEnd"/>
-      <w:r>
-        <w:t>) lassen sich deaktivieren, indem Sie bei der Ausführung von Python die Option -0 übergeben</w:t>
+      <w:r>
+        <w:t>assert prüf</w:t>
+      </w:r>
+      <w:r>
+        <w:t>ung_ob_True, „Message“</w:t>
+      </w:r>
+      <w:r>
+        <w:br/>
+        <w:t>Zusicherungen(assert) lassen sich deaktivieren, indem Sie bei der Ausführung von Python die Option -0 übergeben</w:t>
       </w:r>
     </w:p>
     <w:p/>
     <w:p>
-      <w:proofErr w:type="spellStart"/>
-      <w:r>
-        <w:t>logging</w:t>
-      </w:r>
-      <w:proofErr w:type="spellEnd"/>
-      <w:r>
-        <w:t>:</w:t>
+      <w:r>
+        <w:t>logging:</w:t>
       </w:r>
     </w:p>
     <w:p>
@@ -2413,15 +1215,7 @@
         <w:br/>
       </w:r>
       <w:r>
-        <w:t xml:space="preserve">Seite 294 Web </w:t>
-      </w:r>
-      <w:proofErr w:type="spellStart"/>
-      <w:r>
-        <w:t>Scraping</w:t>
-      </w:r>
-      <w:proofErr w:type="spellEnd"/>
-      <w:r>
-        <w:t xml:space="preserve"> </w:t>
+        <w:t xml:space="preserve">Seite 294 Web Scraping </w:t>
       </w:r>
       <w:r>
         <w:br/>
@@ -2444,17 +1238,7 @@
     <w:p>
       <w:r>
         <w:lastRenderedPageBreak/>
-        <w:t xml:space="preserve">Wiederholen </w:t>
-      </w:r>
-      <w:proofErr w:type="spellStart"/>
-      <w:proofErr w:type="gramStart"/>
-      <w:r>
-        <w:t>RegEx</w:t>
-      </w:r>
-      <w:proofErr w:type="spellEnd"/>
-      <w:proofErr w:type="gramEnd"/>
-      <w:r>
-        <w:t xml:space="preserve"> Seite 198</w:t>
+        <w:t>Wiederholen RegEx Seite 198</w:t>
       </w:r>
     </w:p>
     <w:sectPr>

</xml_diff>

<commit_message>
finshed the repeate of part 1
</commit_message>
<xml_diff>
--- a/docs/Routineaufgaben_Automatisieren.docx
+++ b/docs/Routineaufgaben_Automatisieren.docx
@@ -27,7 +27,7 @@
         <w:t>, 1</w:t>
       </w:r>
       <w:r>
-        <w:t>73</w:t>
+        <w:t>87</w:t>
       </w:r>
     </w:p>
     <w:p>
@@ -39,6 +39,26 @@
       </w:r>
       <w:r>
         <w:t xml:space="preserve"> </w:t>
+      </w:r>
+    </w:p>
+    <w:p>
+      <w:r>
+        <w:t xml:space="preserve">Übungsprojekt, </w:t>
+      </w:r>
+      <w:r>
+        <w:rPr>
+          <w:b/>
+        </w:rPr>
+        <w:t>Seite 187</w:t>
+      </w:r>
+      <w:r>
+        <w:t xml:space="preserve"> </w:t>
+      </w:r>
+      <w:r>
+        <w:rPr>
+          <w:highlight w:val="yellow"/>
+        </w:rPr>
+        <w:t>loop in loop table_frmt_print wiederholen!</w:t>
       </w:r>
     </w:p>
     <w:p>
@@ -1241,6 +1261,8 @@
         <w:t>Wiederholen RegEx Seite 198</w:t>
       </w:r>
     </w:p>
+    <w:p/>
+    <w:p/>
     <w:sectPr>
       <w:type w:val="continuous"/>
       <w:pgSz w:w="11906" w:h="16838"/>

</xml_diff>

<commit_message>
learn on the regex-chapter
</commit_message>
<xml_diff>
--- a/docs/Routineaufgaben_Automatisieren.docx
+++ b/docs/Routineaufgaben_Automatisieren.docx
@@ -24,10 +24,10 @@
         <w:t>, 215</w:t>
       </w:r>
       <w:r>
-        <w:t>, 1</w:t>
-      </w:r>
-      <w:r>
-        <w:t>87</w:t>
+        <w:t xml:space="preserve">, </w:t>
+      </w:r>
+      <w:r>
+        <w:t>217</w:t>
       </w:r>
     </w:p>
     <w:p>

</xml_diff>

<commit_message>
repeate parts of the  debugging-chap
</commit_message>
<xml_diff>
--- a/docs/Routineaufgaben_Automatisieren.docx
+++ b/docs/Routineaufgaben_Automatisieren.docx
@@ -4,6 +4,14 @@
   <w:body>
     <w:p>
       <w:r>
+        <w:t xml:space="preserve">Current Page </w:t>
+      </w:r>
+      <w:r>
+        <w:t>255(282/576)</w:t>
+      </w:r>
+    </w:p>
+    <w:p>
+      <w:r>
         <w:t xml:space="preserve">Seite </w:t>
       </w:r>
       <w:r>
@@ -17,8 +25,13 @@
       </w:r>
     </w:p>
     <w:p>
-      <w:r>
-        <w:t>Wiederholung  Seite 229</w:t>
+      <w:proofErr w:type="gramStart"/>
+      <w:r>
+        <w:t>Wiederholung  Seite</w:t>
+      </w:r>
+      <w:proofErr w:type="gramEnd"/>
+      <w:r>
+        <w:t xml:space="preserve"> 229</w:t>
       </w:r>
       <w:r>
         <w:t>, 215</w:t>
@@ -96,8 +109,13 @@
       </w:r>
     </w:p>
     <w:p>
-      <w:r>
-        <w:t>Dicotonary.get(k, de</w:t>
+      <w:proofErr w:type="gramStart"/>
+      <w:r>
+        <w:t>Dicotonary.get(</w:t>
+      </w:r>
+      <w:proofErr w:type="gramEnd"/>
+      <w:r>
+        <w:t>k, de</w:t>
       </w:r>
       <w:r>
         <w:t>f</w:t>
@@ -128,8 +146,21 @@
       </w:r>
     </w:p>
     <w:p>
-      <w:r>
-        <w:t>spam.sort(key=str.lower)</w:t>
+      <w:proofErr w:type="gramStart"/>
+      <w:r>
+        <w:t>spam.sort</w:t>
+      </w:r>
+      <w:proofErr w:type="gramEnd"/>
+      <w:r>
+        <w:t>(key=</w:t>
+      </w:r>
+      <w:proofErr w:type="gramStart"/>
+      <w:r>
+        <w:t>str.lower</w:t>
+      </w:r>
+      <w:proofErr w:type="gramEnd"/>
+      <w:r>
+        <w:t>)</w:t>
       </w:r>
     </w:p>
     <w:p>
@@ -140,16 +171,48 @@
     <w:p/>
     <w:p>
       <w:r>
-        <w:t xml:space="preserve">Die Methoden rjust() und ljust() werden für einen String aufgerufen und geben </w:t>
+        <w:t xml:space="preserve">Die Methoden </w:t>
+      </w:r>
+      <w:proofErr w:type="gramStart"/>
+      <w:r>
+        <w:t>rjust(</w:t>
+      </w:r>
+      <w:proofErr w:type="gramEnd"/>
+      <w:r>
+        <w:t xml:space="preserve">) und </w:t>
+      </w:r>
+      <w:proofErr w:type="gramStart"/>
+      <w:r>
+        <w:t>ljust(</w:t>
+      </w:r>
+      <w:proofErr w:type="gramEnd"/>
+      <w:r>
+        <w:t xml:space="preserve">) werden für einen String aufgerufen und </w:t>
+      </w:r>
+      <w:proofErr w:type="gramStart"/>
+      <w:r>
+        <w:t xml:space="preserve">geben </w:t>
       </w:r>
       <w:r>
         <w:t xml:space="preserve"> </w:t>
       </w:r>
       <w:r>
-        <w:t>eine Variante dieses Strings zurück, bei der der Text mithilfe von Leerzeichen ausgerichtet ist</w:t>
-      </w:r>
-      <w:r>
-        <w:t>. .center()</w:t>
+        <w:t>eine</w:t>
+      </w:r>
+      <w:proofErr w:type="gramEnd"/>
+      <w:r>
+        <w:t xml:space="preserve"> Variante dieses Strings zurück, bei der der Text mithilfe von Leerzeichen ausgerichtet ist</w:t>
+      </w:r>
+      <w:r>
+        <w:t xml:space="preserve">. </w:t>
+      </w:r>
+      <w:proofErr w:type="gramStart"/>
+      <w:r>
+        <w:t>.center</w:t>
+      </w:r>
+      <w:proofErr w:type="gramEnd"/>
+      <w:r>
+        <w:t>()</w:t>
       </w:r>
     </w:p>
     <w:p>
@@ -160,7 +223,23 @@
     <w:p/>
     <w:p>
       <w:r>
-        <w:t>Das Modul pyperclip enthält die Funktionen copy() und paste(), die Text an die Zwischenablage des Computers senden bzw. von dort empfangen können.</w:t>
+        <w:t xml:space="preserve">Das Modul pyperclip enthält die Funktionen </w:t>
+      </w:r>
+      <w:proofErr w:type="gramStart"/>
+      <w:r>
+        <w:t>copy(</w:t>
+      </w:r>
+      <w:proofErr w:type="gramEnd"/>
+      <w:r>
+        <w:t xml:space="preserve">) und </w:t>
+      </w:r>
+      <w:proofErr w:type="gramStart"/>
+      <w:r>
+        <w:t>paste(</w:t>
+      </w:r>
+      <w:proofErr w:type="gramEnd"/>
+      <w:r>
+        <w:t>), die Text an die Zwischenablage des Computers senden bzw. von dort empfangen können.</w:t>
       </w:r>
     </w:p>
     <w:p/>
@@ -182,7 +261,23 @@
     <w:p/>
     <w:p>
       <w:r>
-        <w:t>Aufgabe Projekt TablePrint Seite 187 wiederholen indexing  mit verschachtelten Schleifen und enum</w:t>
+        <w:t xml:space="preserve">Aufgabe Projekt </w:t>
+      </w:r>
+      <w:proofErr w:type="gramStart"/>
+      <w:r>
+        <w:t>TablePrint</w:t>
+      </w:r>
+      <w:proofErr w:type="gramEnd"/>
+      <w:r>
+        <w:t xml:space="preserve"> Seite 187 wiederholen </w:t>
+      </w:r>
+      <w:proofErr w:type="gramStart"/>
+      <w:r>
+        <w:t>indexing  mit</w:t>
+      </w:r>
+      <w:proofErr w:type="gramEnd"/>
+      <w:r>
+        <w:t xml:space="preserve"> verschachtelten Schleifen und enum</w:t>
       </w:r>
       <w:r>
         <w:t>erate üben</w:t>
@@ -198,12 +293,28 @@
     </w:p>
     <w:p>
       <w:r>
-        <w:t>Widerholungsfragen Regex Seite 218</w:t>
-      </w:r>
-    </w:p>
-    <w:p>
-      <w:r>
-        <w:t xml:space="preserve">Regex Projekt </w:t>
+        <w:t xml:space="preserve">Widerholungsfragen </w:t>
+      </w:r>
+      <w:proofErr w:type="gramStart"/>
+      <w:r>
+        <w:t>Regex</w:t>
+      </w:r>
+      <w:proofErr w:type="gramEnd"/>
+      <w:r>
+        <w:t xml:space="preserve"> Seite 218</w:t>
+      </w:r>
+    </w:p>
+    <w:p>
+      <w:r>
+        <w:t xml:space="preserve">Regex </w:t>
+      </w:r>
+      <w:proofErr w:type="gramStart"/>
+      <w:r>
+        <w:t>Projekt</w:t>
+      </w:r>
+      <w:proofErr w:type="gramEnd"/>
+      <w:r>
+        <w:t xml:space="preserve"> </w:t>
       </w:r>
       <w:r>
         <w:t xml:space="preserve">Seite 220 wiederholen. </w:t>
@@ -214,14 +325,43 @@
     </w:p>
     <w:p/>
     <w:p>
-      <w:r>
-        <w:t>Ppritnt() „Saubere Ausgabe“ Kapitel 5 und Seite 236,</w:t>
+      <w:proofErr w:type="gramStart"/>
+      <w:r>
+        <w:t>Ppritnt(</w:t>
+      </w:r>
+      <w:proofErr w:type="gramEnd"/>
+      <w:r>
+        <w:t>) „Saubere Ausgabe“ Kapitel 5 und Seite 236,</w:t>
       </w:r>
     </w:p>
     <w:p>
       <w:r>
         <w:lastRenderedPageBreak/>
-        <w:t xml:space="preserve">Zb. dictionarys die im Python-Format bleiben sollen mit pprint.pformat() z.B. in als eigenständige Datei, als Modul speichern wird als liste die das dictionary enthält gespeichert. </w:t>
+        <w:t xml:space="preserve">Zb. dictionarys die im Python-Format bleiben sollen mit </w:t>
+      </w:r>
+      <w:proofErr w:type="gramStart"/>
+      <w:r>
+        <w:t>pprint.pformat</w:t>
+      </w:r>
+      <w:proofErr w:type="gramEnd"/>
+      <w:r>
+        <w:t xml:space="preserve">() z.B. in als eigenständige Datei, als Modul speichern wird als </w:t>
+      </w:r>
+      <w:proofErr w:type="gramStart"/>
+      <w:r>
+        <w:t>liste</w:t>
+      </w:r>
+      <w:proofErr w:type="gramEnd"/>
+      <w:r>
+        <w:t xml:space="preserve"> die das dictionary </w:t>
+      </w:r>
+      <w:proofErr w:type="gramStart"/>
+      <w:r>
+        <w:t>enthält</w:t>
+      </w:r>
+      <w:proofErr w:type="gramEnd"/>
+      <w:r>
+        <w:t xml:space="preserve"> gespeichert. </w:t>
       </w:r>
     </w:p>
     <w:p>
@@ -236,7 +376,23 @@
           <w:highlight w:val="yellow"/>
           <w:u w:val="single"/>
         </w:rPr>
-        <w:t xml:space="preserve">Der bist jetzt beste Weg ein </w:t>
+        <w:t xml:space="preserve">Der </w:t>
+      </w:r>
+      <w:proofErr w:type="gramStart"/>
+      <w:r>
+        <w:rPr>
+          <w:highlight w:val="yellow"/>
+          <w:u w:val="single"/>
+        </w:rPr>
+        <w:t>bist</w:t>
+      </w:r>
+      <w:proofErr w:type="gramEnd"/>
+      <w:r>
+        <w:rPr>
+          <w:highlight w:val="yellow"/>
+          <w:u w:val="single"/>
+        </w:rPr>
+        <w:t xml:space="preserve"> jetzt beste Weg ein </w:t>
       </w:r>
       <w:r>
         <w:rPr>
@@ -309,7 +465,15 @@
       </w:r>
       <w:r>
         <w:br/>
-        <w:t>wiederum liest diese Argumente in die Liste sys.argv ein.</w:t>
+        <w:t xml:space="preserve">wiederum liest diese Argumente in die Liste </w:t>
+      </w:r>
+      <w:proofErr w:type="gramStart"/>
+      <w:r>
+        <w:t>sys.argv</w:t>
+      </w:r>
+      <w:proofErr w:type="gramEnd"/>
+      <w:r>
+        <w:t xml:space="preserve"> ein.</w:t>
       </w:r>
     </w:p>
     <w:p/>
@@ -698,12 +862,21 @@
           <w:lang w:val="en-US"/>
         </w:rPr>
       </w:pPr>
+      <w:proofErr w:type="gramStart"/>
       <w:r>
         <w:rPr>
           <w:lang w:val="en-US"/>
         </w:rPr>
-        <w:t>os.path.</w:t>
-      </w:r>
+        <w:t>os.path</w:t>
+      </w:r>
+      <w:proofErr w:type="gramEnd"/>
+      <w:r>
+        <w:rPr>
+          <w:lang w:val="en-US"/>
+        </w:rPr>
+        <w:t>.</w:t>
+      </w:r>
+      <w:proofErr w:type="gramStart"/>
       <w:r>
         <w:rPr>
           <w:b/>
@@ -715,12 +888,24 @@
         <w:rPr>
           <w:lang w:val="en-US"/>
         </w:rPr>
-        <w:t xml:space="preserve">('C:\\Windows', 'C:\\spam\\eggs') </w:t>
-      </w:r>
-    </w:p>
-    <w:p>
-      <w:r>
-        <w:t>'..\\..\\Windows'</w:t>
+        <w:t>(</w:t>
+      </w:r>
+      <w:proofErr w:type="gramEnd"/>
+      <w:r>
+        <w:rPr>
+          <w:lang w:val="en-US"/>
+        </w:rPr>
+        <w:t xml:space="preserve">'C:\\Windows', 'C:\\spam\\eggs') </w:t>
+      </w:r>
+    </w:p>
+    <w:p>
+      <w:proofErr w:type="gramStart"/>
+      <w:r>
+        <w:t>'..</w:t>
+      </w:r>
+      <w:proofErr w:type="gramEnd"/>
+      <w:r>
+        <w:t>\\..\\Windows'</w:t>
       </w:r>
     </w:p>
     <w:p/>
@@ -751,20 +936,43 @@
         <w:br/>
         <w:t xml:space="preserve">in OS:  </w:t>
       </w:r>
-      <w:r>
-        <w:t>os.path.basename(path)</w:t>
-      </w:r>
-    </w:p>
-    <w:p>
-      <w:r>
-        <w:t>Verzeichnisname in pathlib:= path_objekt.parent</w:t>
-      </w:r>
+      <w:proofErr w:type="gramStart"/>
+      <w:r>
+        <w:t>os.path</w:t>
+      </w:r>
+      <w:proofErr w:type="gramEnd"/>
+      <w:r>
+        <w:t>.basename(path)</w:t>
+      </w:r>
+    </w:p>
+    <w:p>
+      <w:r>
+        <w:t xml:space="preserve">Verzeichnisname in </w:t>
+      </w:r>
+      <w:proofErr w:type="gramStart"/>
+      <w:r>
+        <w:t>pathlib:=</w:t>
+      </w:r>
+      <w:proofErr w:type="gramEnd"/>
+      <w:r>
+        <w:t xml:space="preserve"> path_</w:t>
+      </w:r>
+      <w:proofErr w:type="gramStart"/>
+      <w:r>
+        <w:t>objekt.parent</w:t>
+      </w:r>
+      <w:proofErr w:type="gramEnd"/>
       <w:r>
         <w:br/>
         <w:t xml:space="preserve">in OS: </w:t>
       </w:r>
-      <w:r>
-        <w:t>os.path.</w:t>
+      <w:proofErr w:type="gramStart"/>
+      <w:r>
+        <w:t>os.path</w:t>
+      </w:r>
+      <w:proofErr w:type="gramEnd"/>
+      <w:r>
+        <w:t>.</w:t>
       </w:r>
       <w:r>
         <w:t>dirname</w:t>
@@ -774,11 +982,21 @@
       </w:r>
     </w:p>
     <w:p>
-      <w:r>
-        <w:t xml:space="preserve">Tupel(vezeinsname, basename) = </w:t>
-      </w:r>
-      <w:r>
-        <w:t>os.path.split(</w:t>
+      <w:proofErr w:type="gramStart"/>
+      <w:r>
+        <w:t>Tupel(</w:t>
+      </w:r>
+      <w:proofErr w:type="gramEnd"/>
+      <w:r>
+        <w:t xml:space="preserve">vezeinsname, basename) = </w:t>
+      </w:r>
+      <w:proofErr w:type="gramStart"/>
+      <w:r>
+        <w:t>os.path</w:t>
+      </w:r>
+      <w:proofErr w:type="gramEnd"/>
+      <w:r>
+        <w:t>.split(</w:t>
       </w:r>
       <w:r>
         <w:t>path</w:t>
@@ -795,34 +1013,124 @@
           <w:sz w:val="16"/>
           <w:szCs w:val="16"/>
         </w:rPr>
-        <w:t>Allerdings ist os.path.split() eine praktische Abkürzung.</w:t>
-      </w:r>
+        <w:t xml:space="preserve">Allerdings ist </w:t>
+      </w:r>
+      <w:proofErr w:type="gramStart"/>
       <w:r>
         <w:rPr>
           <w:rFonts w:ascii="Arial" w:hAnsi="Arial" w:cs="Arial"/>
           <w:sz w:val="16"/>
           <w:szCs w:val="16"/>
         </w:rPr>
-        <w:br/>
-        <w:t xml:space="preserve">Beachten Sie aber, dass os.path.split() keinen Dateipfad entgegennimmt und </w:t>
-      </w:r>
+        <w:t>os.path</w:t>
+      </w:r>
+      <w:proofErr w:type="gramEnd"/>
       <w:r>
         <w:rPr>
           <w:rFonts w:ascii="Arial" w:hAnsi="Arial" w:cs="Arial"/>
           <w:sz w:val="16"/>
           <w:szCs w:val="16"/>
         </w:rPr>
-        <w:br/>
-        <w:t xml:space="preserve">daraus eine Liste der Strings für die einzelnen Ordner zurückgibt. Für diesen </w:t>
-      </w:r>
+        <w:t>.</w:t>
+      </w:r>
+      <w:proofErr w:type="gramStart"/>
       <w:r>
         <w:rPr>
           <w:rFonts w:ascii="Arial" w:hAnsi="Arial" w:cs="Arial"/>
           <w:sz w:val="16"/>
           <w:szCs w:val="16"/>
         </w:rPr>
-        <w:br/>
-        <w:t xml:space="preserve">Zweck müssen Sie den Pfad mit der Stringmethode split() zerlegen und ihr die </w:t>
+        <w:t>split(</w:t>
+      </w:r>
+      <w:proofErr w:type="gramEnd"/>
+      <w:r>
+        <w:rPr>
+          <w:rFonts w:ascii="Arial" w:hAnsi="Arial" w:cs="Arial"/>
+          <w:sz w:val="16"/>
+          <w:szCs w:val="16"/>
+        </w:rPr>
+        <w:t>) eine praktische Abkürzung.</w:t>
+      </w:r>
+      <w:r>
+        <w:rPr>
+          <w:rFonts w:ascii="Arial" w:hAnsi="Arial" w:cs="Arial"/>
+          <w:sz w:val="16"/>
+          <w:szCs w:val="16"/>
+        </w:rPr>
+        <w:br/>
+        <w:t xml:space="preserve">Beachten Sie aber, dass </w:t>
+      </w:r>
+      <w:proofErr w:type="gramStart"/>
+      <w:r>
+        <w:rPr>
+          <w:rFonts w:ascii="Arial" w:hAnsi="Arial" w:cs="Arial"/>
+          <w:sz w:val="16"/>
+          <w:szCs w:val="16"/>
+        </w:rPr>
+        <w:t>os.path</w:t>
+      </w:r>
+      <w:proofErr w:type="gramEnd"/>
+      <w:r>
+        <w:rPr>
+          <w:rFonts w:ascii="Arial" w:hAnsi="Arial" w:cs="Arial"/>
+          <w:sz w:val="16"/>
+          <w:szCs w:val="16"/>
+        </w:rPr>
+        <w:t>.</w:t>
+      </w:r>
+      <w:proofErr w:type="gramStart"/>
+      <w:r>
+        <w:rPr>
+          <w:rFonts w:ascii="Arial" w:hAnsi="Arial" w:cs="Arial"/>
+          <w:sz w:val="16"/>
+          <w:szCs w:val="16"/>
+        </w:rPr>
+        <w:t>split(</w:t>
+      </w:r>
+      <w:proofErr w:type="gramEnd"/>
+      <w:r>
+        <w:rPr>
+          <w:rFonts w:ascii="Arial" w:hAnsi="Arial" w:cs="Arial"/>
+          <w:sz w:val="16"/>
+          <w:szCs w:val="16"/>
+        </w:rPr>
+        <w:t xml:space="preserve">) keinen Dateipfad entgegennimmt und </w:t>
+      </w:r>
+      <w:r>
+        <w:rPr>
+          <w:rFonts w:ascii="Arial" w:hAnsi="Arial" w:cs="Arial"/>
+          <w:sz w:val="16"/>
+          <w:szCs w:val="16"/>
+        </w:rPr>
+        <w:br/>
+        <w:t xml:space="preserve">daraus eine Liste der Strings für die einzelnen Ordner zurückgibt. Für diesen </w:t>
+      </w:r>
+      <w:r>
+        <w:rPr>
+          <w:rFonts w:ascii="Arial" w:hAnsi="Arial" w:cs="Arial"/>
+          <w:sz w:val="16"/>
+          <w:szCs w:val="16"/>
+        </w:rPr>
+        <w:br/>
+        <w:t xml:space="preserve">Zweck müssen Sie den Pfad mit der Stringmethode </w:t>
+      </w:r>
+      <w:proofErr w:type="gramStart"/>
+      <w:r>
+        <w:rPr>
+          <w:rFonts w:ascii="Arial" w:hAnsi="Arial" w:cs="Arial"/>
+          <w:sz w:val="16"/>
+          <w:szCs w:val="16"/>
+        </w:rPr>
+        <w:t>split(</w:t>
+      </w:r>
+      <w:proofErr w:type="gramEnd"/>
+      <w:r>
+        <w:rPr>
+          <w:rFonts w:ascii="Arial" w:hAnsi="Arial" w:cs="Arial"/>
+          <w:sz w:val="16"/>
+          <w:szCs w:val="16"/>
+        </w:rPr>
+        <w:t xml:space="preserve">) zerlegen und ihr die </w:t>
       </w:r>
       <w:r>
         <w:rPr>
@@ -866,7 +1174,15 @@
     </w:p>
     <w:p>
       <w:r>
-        <w:t>Die Methode `Path.chmod()` in der `pathlib`-Bibliothek wird verwendet, um die Berechtigungen (Zugriffsrechte) einer Datei oder eines Verzeichnisses zu ändern. Diese Methode ist eine Entsprechung zu `os.chmod()` und ermöglicht es dir, die Zugriffsrechte auf Dateien und Verzeichnisse zu setzen, indem du den entsprechenden Berechtigungsmodus angibst.</w:t>
+        <w:t>Die Methode `Path.chmod</w:t>
+      </w:r>
+      <w:proofErr w:type="gramStart"/>
+      <w:r>
+        <w:t>()`</w:t>
+      </w:r>
+      <w:proofErr w:type="gramEnd"/>
+      <w:r>
+        <w:t xml:space="preserve"> in der `pathlib`-Bibliothek wird verwendet, um die Berechtigungen (Zugriffsrechte) einer Datei oder eines Verzeichnisses zu ändern. Diese Methode ist eine Entsprechung zu `os.chmod()` und ermöglicht es dir, die Zugriffsrechte auf Dateien und Verzeichnisse zu setzen, indem du den entsprechenden Berechtigungsmodus angibst.</w:t>
       </w:r>
       <w:r>
         <w:br/>
@@ -874,8 +1190,13 @@
       <w:r>
         <w:lastRenderedPageBreak/>
         <w:br/>
-        <w:t>### Verwendung von `Path.chmod()`</w:t>
-      </w:r>
+        <w:t>### Verwendung von `Path.chmod</w:t>
+      </w:r>
+      <w:proofErr w:type="gramStart"/>
+      <w:r>
+        <w:t>()`</w:t>
+      </w:r>
+      <w:proofErr w:type="gramEnd"/>
       <w:r>
         <w:br/>
       </w:r>
@@ -892,7 +1213,15 @@
       </w:r>
       <w:r>
         <w:br/>
-        <w:t># Definiere den Pfad zur Datei</w:t>
+        <w:t xml:space="preserve"># </w:t>
+      </w:r>
+      <w:proofErr w:type="gramStart"/>
+      <w:r>
+        <w:t>Definiere</w:t>
+      </w:r>
+      <w:proofErr w:type="gramEnd"/>
+      <w:r>
+        <w:t xml:space="preserve"> den Pfad zur Datei</w:t>
       </w:r>
       <w:r>
         <w:br/>
@@ -903,11 +1232,26 @@
       </w:r>
       <w:r>
         <w:br/>
-        <w:t># Ändere die Berechtigungen auf 0o644 (rw-r--r--)</w:t>
-      </w:r>
-      <w:r>
-        <w:br/>
-        <w:t>path.chmod(0o644)</w:t>
+        <w:t xml:space="preserve"># </w:t>
+      </w:r>
+      <w:proofErr w:type="gramStart"/>
+      <w:r>
+        <w:t>Ändere</w:t>
+      </w:r>
+      <w:proofErr w:type="gramEnd"/>
+      <w:r>
+        <w:t xml:space="preserve"> die Berechtigungen auf 0o644 (rw-r--r--)</w:t>
+      </w:r>
+      <w:r>
+        <w:br/>
+      </w:r>
+      <w:proofErr w:type="gramStart"/>
+      <w:r>
+        <w:t>path.chmod</w:t>
+      </w:r>
+      <w:proofErr w:type="gramEnd"/>
+      <w:r>
+        <w:t>(0o644)</w:t>
       </w:r>
       <w:r>
         <w:br/>
@@ -1030,7 +1374,15 @@
       </w:r>
       <w:r>
         <w:br/>
-        <w:t>2. Die Berechtigungen der Datei werden vor und nach der Verwendung von `chmod()` ausgedruckt.</w:t>
+        <w:t>2. Die Berechtigungen der Datei werden vor und nach der Verwendung von `</w:t>
+      </w:r>
+      <w:proofErr w:type="gramStart"/>
+      <w:r>
+        <w:t>chmod(</w:t>
+      </w:r>
+      <w:proofErr w:type="gramEnd"/>
+      <w:r>
+        <w:t>)` ausgedruckt.</w:t>
       </w:r>
       <w:r>
         <w:br/>
@@ -1056,37 +1408,96 @@
       </w:r>
       <w:r>
         <w:br/>
-        <w:t>- **Berechtigungsänderungen**: `chmod()` funktioniert nur bei Dateien und Verzeichnissen, die im Dateisystem existieren.</w:t>
-      </w:r>
-      <w:r>
-        <w:br/>
-        <w:t>- **Plattformabhängigkeit**: `chmod()` funktioniert in der Regel auf Unix-ähnlichen Systemen (wie Linux und macOS). Auf Windows-Systemen werden Berechtigungen anders gehandhabt, und `chmod()` hat möglicherweise eine eingeschränkte Wirkung.</w:t>
-      </w:r>
-      <w:r>
-        <w:br/>
-      </w:r>
-      <w:r>
-        <w:br/>
-        <w:t>Die Methode `Path.chmod()` bietet eine objektorientierte Möglichkeit, Dateiberechtigungen zu ändern, und integriert sich nahtlos in die `pathlib`-Bibliothek, die für die Arbeit mit Pfaden und Dateien in Python entwickelt wurde.</w:t>
-      </w:r>
-      <w:r>
-        <w:br/>
-      </w:r>
-    </w:p>
-    <w:p>
-      <w:r>
-        <w:t>pathlib bietet eine Methode zur Bestimmung der Größe einer Datei, die der Funktion os.path.getsize() entspricht.</w:t>
-      </w:r>
-    </w:p>
-    <w:p>
-      <w:r>
-        <w:t xml:space="preserve">In pathlib kannst du die Methode </w:t>
+        <w:t>- **Berechtigungsänderungen**: `</w:t>
+      </w:r>
+      <w:proofErr w:type="gramStart"/>
+      <w:r>
+        <w:t>chmod(</w:t>
+      </w:r>
+      <w:proofErr w:type="gramEnd"/>
+      <w:r>
+        <w:t>)` funktioniert nur bei Dateien und Verzeichnissen, die im Dateisystem existieren.</w:t>
+      </w:r>
+      <w:r>
+        <w:br/>
+        <w:t>- **Plattformabhängigkeit**: `</w:t>
+      </w:r>
+      <w:proofErr w:type="gramStart"/>
+      <w:r>
+        <w:t>chmod(</w:t>
+      </w:r>
+      <w:proofErr w:type="gramEnd"/>
+      <w:r>
+        <w:t>)` funktioniert in der Regel auf Unix-ähnlichen Systemen (wie Linux und macOS). Auf Windows-Systemen werden Berechtigungen anders gehandhabt, und `</w:t>
+      </w:r>
+      <w:proofErr w:type="gramStart"/>
+      <w:r>
+        <w:t>chmod(</w:t>
+      </w:r>
+      <w:proofErr w:type="gramEnd"/>
+      <w:r>
+        <w:t>)` hat möglicherweise eine eingeschränkte Wirkung.</w:t>
+      </w:r>
+      <w:r>
+        <w:br/>
+      </w:r>
+      <w:r>
+        <w:br/>
+        <w:t>Die Methode `Path.chmod</w:t>
+      </w:r>
+      <w:proofErr w:type="gramStart"/>
+      <w:r>
+        <w:t>()`</w:t>
+      </w:r>
+      <w:proofErr w:type="gramEnd"/>
+      <w:r>
+        <w:t xml:space="preserve"> bietet eine objektorientierte Möglichkeit, Dateiberechtigungen zu ändern, und integriert sich nahtlos in die `pathlib`-Bibliothek, die für die Arbeit mit Pfaden und Dateien in Python entwickelt wurde.</w:t>
+      </w:r>
+      <w:r>
+        <w:br/>
+      </w:r>
+    </w:p>
+    <w:p>
+      <w:r>
+        <w:t xml:space="preserve">pathlib bietet eine Methode zur Bestimmung der Größe einer Datei, die der Funktion </w:t>
+      </w:r>
+      <w:proofErr w:type="gramStart"/>
+      <w:r>
+        <w:t>os.path</w:t>
+      </w:r>
+      <w:proofErr w:type="gramEnd"/>
+      <w:r>
+        <w:t>.</w:t>
+      </w:r>
+      <w:proofErr w:type="gramStart"/>
+      <w:r>
+        <w:t>getsize(</w:t>
+      </w:r>
+      <w:proofErr w:type="gramEnd"/>
+      <w:r>
+        <w:t>) entspricht.</w:t>
+      </w:r>
+    </w:p>
+    <w:p>
+      <w:r>
+        <w:t xml:space="preserve">In pathlib kannst du die </w:t>
+      </w:r>
+      <w:proofErr w:type="gramStart"/>
+      <w:r>
+        <w:t xml:space="preserve">Methode </w:t>
       </w:r>
       <w:r>
         <w:rPr>
           <w:b/>
         </w:rPr>
-        <w:t>.stat()</w:t>
+        <w:t>.stat</w:t>
+      </w:r>
+      <w:proofErr w:type="gramEnd"/>
+      <w:r>
+        <w:rPr>
+          <w:b/>
+        </w:rPr>
+        <w:t>()</w:t>
       </w:r>
       <w:r>
         <w:t xml:space="preserve"> verwenden, um verschiedene Dateieigenschaften abzurufen, einschließlich der Größe der Datei. Die Größe wird im Attribut </w:t>
@@ -1098,7 +1509,23 @@
         <w:t>st_size</w:t>
       </w:r>
       <w:r>
-        <w:t xml:space="preserve"> des os.stat_result-Objekts gespeichert, das von .stat() zurückgegeben wird.</w:t>
+        <w:t xml:space="preserve"> des </w:t>
+      </w:r>
+      <w:proofErr w:type="gramStart"/>
+      <w:r>
+        <w:t>os.stat</w:t>
+      </w:r>
+      <w:proofErr w:type="gramEnd"/>
+      <w:r>
+        <w:t xml:space="preserve">_result-Objekts gespeichert, das </w:t>
+      </w:r>
+      <w:proofErr w:type="gramStart"/>
+      <w:r>
+        <w:t>von .stat</w:t>
+      </w:r>
+      <w:proofErr w:type="gramEnd"/>
+      <w:r>
+        <w:t>() zurückgegeben wird.</w:t>
       </w:r>
     </w:p>
     <w:p/>
@@ -1175,23 +1602,23 @@
           <w:rFonts w:ascii="JetBrains Mono NL" w:hAnsi="JetBrains Mono NL" w:cs="JetBrains Mono NL"/>
           <w:lang w:val="en-US"/>
         </w:rPr>
-        <w:t xml:space="preserve"> raise Exception('This is the error message.') </w:t>
-      </w:r>
+        <w:t xml:space="preserve"> raise </w:t>
+      </w:r>
+      <w:proofErr w:type="gramStart"/>
       <w:r>
         <w:rPr>
           <w:rFonts w:ascii="JetBrains Mono NL" w:hAnsi="JetBrains Mono NL" w:cs="JetBrains Mono NL"/>
           <w:lang w:val="en-US"/>
         </w:rPr>
-        <w:br/>
-        <w:t xml:space="preserve">except: </w:t>
-      </w:r>
+        <w:t>Exception(</w:t>
+      </w:r>
+      <w:proofErr w:type="gramEnd"/>
       <w:r>
         <w:rPr>
           <w:rFonts w:ascii="JetBrains Mono NL" w:hAnsi="JetBrains Mono NL" w:cs="JetBrains Mono NL"/>
           <w:lang w:val="en-US"/>
         </w:rPr>
-        <w:br/>
-        <w:t xml:space="preserve"> errorFile = open('errorInfo.txt', 'w') </w:t>
+        <w:t xml:space="preserve">'This is the error message.') </w:t>
       </w:r>
       <w:r>
         <w:rPr>
@@ -1199,7 +1626,7 @@
           <w:lang w:val="en-US"/>
         </w:rPr>
         <w:br/>
-        <w:t xml:space="preserve"> errorFile.write(traceback.format_exc()) </w:t>
+        <w:t xml:space="preserve">except: </w:t>
       </w:r>
       <w:r>
         <w:rPr>
@@ -1207,15 +1634,95 @@
           <w:lang w:val="en-US"/>
         </w:rPr>
         <w:br/>
-        <w:t xml:space="preserve"> errorFile.close() </w:t>
-      </w:r>
+        <w:t xml:space="preserve"> errorFile = </w:t>
+      </w:r>
+      <w:proofErr w:type="gramStart"/>
       <w:r>
         <w:rPr>
           <w:rFonts w:ascii="JetBrains Mono NL" w:hAnsi="JetBrains Mono NL" w:cs="JetBrains Mono NL"/>
           <w:lang w:val="en-US"/>
         </w:rPr>
-        <w:br/>
-        <w:t xml:space="preserve"> print('The traceback info was written to errorInfo.txt.') </w:t>
+        <w:t>open(</w:t>
+      </w:r>
+      <w:proofErr w:type="gramEnd"/>
+      <w:r>
+        <w:rPr>
+          <w:rFonts w:ascii="JetBrains Mono NL" w:hAnsi="JetBrains Mono NL" w:cs="JetBrains Mono NL"/>
+          <w:lang w:val="en-US"/>
+        </w:rPr>
+        <w:t xml:space="preserve">'errorInfo.txt', 'w') </w:t>
+      </w:r>
+      <w:r>
+        <w:rPr>
+          <w:rFonts w:ascii="JetBrains Mono NL" w:hAnsi="JetBrains Mono NL" w:cs="JetBrains Mono NL"/>
+          <w:lang w:val="en-US"/>
+        </w:rPr>
+        <w:br/>
+        <w:t xml:space="preserve"> errorFile.write(</w:t>
+      </w:r>
+      <w:proofErr w:type="gramStart"/>
+      <w:r>
+        <w:rPr>
+          <w:rFonts w:ascii="JetBrains Mono NL" w:hAnsi="JetBrains Mono NL" w:cs="JetBrains Mono NL"/>
+          <w:lang w:val="en-US"/>
+        </w:rPr>
+        <w:t>traceback.format</w:t>
+      </w:r>
+      <w:proofErr w:type="gramEnd"/>
+      <w:r>
+        <w:rPr>
+          <w:rFonts w:ascii="JetBrains Mono NL" w:hAnsi="JetBrains Mono NL" w:cs="JetBrains Mono NL"/>
+          <w:lang w:val="en-US"/>
+        </w:rPr>
+        <w:t>_</w:t>
+      </w:r>
+      <w:proofErr w:type="gramStart"/>
+      <w:r>
+        <w:rPr>
+          <w:rFonts w:ascii="JetBrains Mono NL" w:hAnsi="JetBrains Mono NL" w:cs="JetBrains Mono NL"/>
+          <w:lang w:val="en-US"/>
+        </w:rPr>
+        <w:t>exc(</w:t>
+      </w:r>
+      <w:proofErr w:type="gramEnd"/>
+      <w:r>
+        <w:rPr>
+          <w:rFonts w:ascii="JetBrains Mono NL" w:hAnsi="JetBrains Mono NL" w:cs="JetBrains Mono NL"/>
+          <w:lang w:val="en-US"/>
+        </w:rPr>
+        <w:t xml:space="preserve">)) </w:t>
+      </w:r>
+      <w:r>
+        <w:rPr>
+          <w:rFonts w:ascii="JetBrains Mono NL" w:hAnsi="JetBrains Mono NL" w:cs="JetBrains Mono NL"/>
+          <w:lang w:val="en-US"/>
+        </w:rPr>
+        <w:br/>
+        <w:t xml:space="preserve"> errorFile.close() </w:t>
+      </w:r>
+      <w:r>
+        <w:rPr>
+          <w:rFonts w:ascii="JetBrains Mono NL" w:hAnsi="JetBrains Mono NL" w:cs="JetBrains Mono NL"/>
+          <w:lang w:val="en-US"/>
+        </w:rPr>
+        <w:br/>
+        <w:t xml:space="preserve"> </w:t>
+      </w:r>
+      <w:proofErr w:type="gramStart"/>
+      <w:r>
+        <w:rPr>
+          <w:rFonts w:ascii="JetBrains Mono NL" w:hAnsi="JetBrains Mono NL" w:cs="JetBrains Mono NL"/>
+          <w:lang w:val="en-US"/>
+        </w:rPr>
+        <w:t>print(</w:t>
+      </w:r>
+      <w:proofErr w:type="gramEnd"/>
+      <w:r>
+        <w:rPr>
+          <w:rFonts w:ascii="JetBrains Mono NL" w:hAnsi="JetBrains Mono NL" w:cs="JetBrains Mono NL"/>
+          <w:lang w:val="en-US"/>
+        </w:rPr>
+        <w:t xml:space="preserve">'The traceback info was written to errorInfo.txt.') </w:t>
       </w:r>
       <w:r>
         <w:rPr>
@@ -1290,7 +1797,15 @@
     <w:p/>
     <w:p>
       <w:r>
-        <w:t>Wiederholen RegEx Seite 198</w:t>
+        <w:t xml:space="preserve">Wiederholen </w:t>
+      </w:r>
+      <w:proofErr w:type="gramStart"/>
+      <w:r>
+        <w:t>RegEx</w:t>
+      </w:r>
+      <w:proofErr w:type="gramEnd"/>
+      <w:r>
+        <w:t xml:space="preserve"> Seite 198</w:t>
       </w:r>
     </w:p>
     <w:p/>

</xml_diff>